<commit_message>
Regenerate Direct spec Word docs with tables and formatting
Add md_spec_to_docx.py; CPA docx includes appendix with ad texts from CSV.

Co-authored-by: Igor-Lark <Igor-Lark@users.noreply.github.com>
</commit_message>
<xml_diff>
--- a/ads/marmara-pro/termopaneli-priozersky-adgroup.docx
+++ b/ads/marmara-pro/termopaneli-priozersky-adgroup.docx
@@ -4,25 +4,737 @@
   <w:body>
     <w:p>
       <w:pPr>
-        <w:pStyle w:val="Heading1"/>
+        <w:pStyle w:val="Title"/>
       </w:pPr>
       <w:r>
         <w:t>Группа объявлений: Термопанели — Приозерский район</w:t>
       </w:r>
     </w:p>
     <w:p>
+      <w:pPr/>
       <w:r>
-        <w:t>Рекламная группа для продвижения фасадных термопанелей с клинкерной плиткой **КлинкерПрофи** в **Приозерском районе** Ленинградской области.</w:t>
+        <w:rPr>
+          <w:b w:val="0"/>
+        </w:rPr>
+        <w:t>Клиент: КлинкерПрофи · ИП Баушев Дмитрий Викторович · г. Выборг</w:t>
+      </w:r>
+    </w:p>
+    <w:p/>
+    <w:p>
+      <w:pPr/>
+      <w:r>
+        <w:rPr>
+          <w:b w:val="0"/>
+        </w:rPr>
+        <w:t xml:space="preserve">Рекламная группа для продвижения фасадных термопанелей с клинкерной плиткой </w:t>
+      </w:r>
+      <w:r>
+        <w:rPr>
+          <w:b/>
+        </w:rPr>
+        <w:t>КлинкерПрофи</w:t>
+      </w:r>
+      <w:r>
+        <w:rPr>
+          <w:b w:val="0"/>
+        </w:rPr>
+        <w:t xml:space="preserve"> в </w:t>
+      </w:r>
+      <w:r>
+        <w:rPr>
+          <w:b/>
+        </w:rPr>
+        <w:t>Приозерском районе</w:t>
+      </w:r>
+      <w:r>
+        <w:rPr>
+          <w:b w:val="0"/>
+        </w:rPr>
+        <w:t xml:space="preserve"> Ленинградской области.</w:t>
+      </w:r>
+    </w:p>
+    <w:p>
+      <w:pPr>
+        <w:ind w:left="360"/>
+      </w:pPr>
+      <w:r>
+        <w:rPr>
+          <w:b/>
+          <w:i/>
+        </w:rPr>
+        <w:t>Отдельная поисковая кампания (CPA):</w:t>
+      </w:r>
+      <w:r>
+        <w:rPr>
+          <w:b w:val="0"/>
+          <w:i/>
+        </w:rPr>
+        <w:t xml:space="preserve"> см. termopaneli-priozersky-campaign-cpa.md и Word termopaneli-priozersky-campaign-cpa.docx — «Максимум конверсий», только Поиск, UTM termopaneli_priozersk_cpa_search.</w:t>
+      </w:r>
+    </w:p>
+    <w:p>
+      <w:pPr>
+        <w:ind w:left="360"/>
+      </w:pPr>
+      <w:r>
+        <w:rPr>
+          <w:b/>
+          <w:i/>
+        </w:rPr>
+        <w:t>Бренд:</w:t>
+      </w:r>
+      <w:r>
+        <w:rPr>
+          <w:b w:val="0"/>
+          <w:i/>
+        </w:rPr>
+        <w:t xml:space="preserve"> в объявлениях и названиях кампаний — только </w:t>
+      </w:r>
+      <w:r>
+        <w:rPr>
+          <w:b/>
+          <w:i/>
+        </w:rPr>
+        <w:t>КлинкерПрофи</w:t>
+      </w:r>
+      <w:r>
+        <w:rPr>
+          <w:b w:val="0"/>
+          <w:i/>
+        </w:rPr>
+        <w:t xml:space="preserve"> (не Marmara PRO / «Мармара Про»).</w:t>
+      </w:r>
+    </w:p>
+    <w:p>
+      <w:pPr>
+        <w:pStyle w:val="Heading1"/>
+      </w:pPr>
+      <w:r>
+        <w:t>1. Параметры кампании</w:t>
+      </w:r>
+    </w:p>
+    <w:tbl>
+      <w:tblPr>
+        <w:tblStyle w:val="TableGrid"/>
+        <w:tblW w:type="auto" w:w="0"/>
+        <w:tblLook w:firstColumn="1" w:firstRow="1" w:lastColumn="0" w:lastRow="0" w:noHBand="0" w:noVBand="1" w:val="04A0"/>
+      </w:tblPr>
+      <w:tblGrid>
+        <w:gridCol w:w="4320"/>
+        <w:gridCol w:w="4320"/>
+      </w:tblGrid>
+      <w:tr>
+        <w:tc>
+          <w:tcPr>
+            <w:tcW w:type="dxa" w:w="4320"/>
+          </w:tcPr>
+          <w:p>
+            <w:r>
+              <w:rPr>
+                <w:b/>
+              </w:rPr>
+            </w:r>
+            <w:r>
+              <w:rPr>
+                <w:b/>
+              </w:rPr>
+              <w:t>Параметр</w:t>
+            </w:r>
+          </w:p>
+        </w:tc>
+        <w:tc>
+          <w:tcPr>
+            <w:tcW w:type="dxa" w:w="4320"/>
+          </w:tcPr>
+          <w:p>
+            <w:r>
+              <w:rPr>
+                <w:b/>
+              </w:rPr>
+            </w:r>
+            <w:r>
+              <w:rPr>
+                <w:b/>
+              </w:rPr>
+              <w:t>Значение</w:t>
+            </w:r>
+          </w:p>
+        </w:tc>
+      </w:tr>
+      <w:tr>
+        <w:tc>
+          <w:tcPr>
+            <w:tcW w:type="dxa" w:w="4320"/>
+          </w:tcPr>
+          <w:p>
+            <w:r/>
+            <w:r>
+              <w:rPr>
+                <w:b/>
+              </w:rPr>
+              <w:t>Кампания</w:t>
+            </w:r>
+          </w:p>
+        </w:tc>
+        <w:tc>
+          <w:tcPr>
+            <w:tcW w:type="dxa" w:w="4320"/>
+          </w:tcPr>
+          <w:p>
+            <w:r/>
+            <w:r>
+              <w:rPr>
+                <w:b w:val="0"/>
+              </w:rPr>
+              <w:t>Термопанели (поиск) — существующая или создать по инструкции ниже</w:t>
+            </w:r>
+          </w:p>
+        </w:tc>
+      </w:tr>
+      <w:tr>
+        <w:tc>
+          <w:tcPr>
+            <w:tcW w:type="dxa" w:w="4320"/>
+          </w:tcPr>
+          <w:p>
+            <w:r/>
+            <w:r>
+              <w:rPr>
+                <w:b/>
+              </w:rPr>
+              <w:t>Название группы</w:t>
+            </w:r>
+          </w:p>
+        </w:tc>
+        <w:tc>
+          <w:tcPr>
+            <w:tcW w:type="dxa" w:w="4320"/>
+          </w:tcPr>
+          <w:p>
+            <w:r/>
+            <w:r>
+              <w:rPr>
+                <w:b w:val="0"/>
+              </w:rPr>
+              <w:t>Приозерский район</w:t>
+            </w:r>
+          </w:p>
+        </w:tc>
+      </w:tr>
+      <w:tr>
+        <w:tc>
+          <w:tcPr>
+            <w:tcW w:type="dxa" w:w="4320"/>
+          </w:tcPr>
+          <w:p>
+            <w:r/>
+            <w:r>
+              <w:rPr>
+                <w:b/>
+              </w:rPr>
+              <w:t>Тип</w:t>
+            </w:r>
+          </w:p>
+        </w:tc>
+        <w:tc>
+          <w:tcPr>
+            <w:tcW w:type="dxa" w:w="4320"/>
+          </w:tcPr>
+          <w:p>
+            <w:r/>
+            <w:r>
+              <w:rPr>
+                <w:b w:val="0"/>
+              </w:rPr>
+              <w:t>Текстово-графические объявления, поиск</w:t>
+            </w:r>
+          </w:p>
+        </w:tc>
+      </w:tr>
+      <w:tr>
+        <w:tc>
+          <w:tcPr>
+            <w:tcW w:type="dxa" w:w="4320"/>
+          </w:tcPr>
+          <w:p>
+            <w:r/>
+            <w:r>
+              <w:rPr>
+                <w:b/>
+              </w:rPr>
+              <w:t>Посадочная страница</w:t>
+            </w:r>
+          </w:p>
+        </w:tc>
+        <w:tc>
+          <w:tcPr>
+            <w:tcW w:type="dxa" w:w="4320"/>
+          </w:tcPr>
+          <w:p>
+            <w:r/>
+            <w:r>
+              <w:rPr>
+                <w:b w:val="0"/>
+              </w:rPr>
+              <w:t>https://marmara-pro.ru/termo</w:t>
+            </w:r>
+          </w:p>
+        </w:tc>
+      </w:tr>
+      <w:tr>
+        <w:tc>
+          <w:tcPr>
+            <w:tcW w:type="dxa" w:w="4320"/>
+          </w:tcPr>
+          <w:p>
+            <w:r/>
+            <w:r>
+              <w:rPr>
+                <w:b/>
+              </w:rPr>
+              <w:t>Геотargeting группы</w:t>
+            </w:r>
+          </w:p>
+        </w:tc>
+        <w:tc>
+          <w:tcPr>
+            <w:tcW w:type="dxa" w:w="4320"/>
+          </w:tcPr>
+          <w:p>
+            <w:r/>
+            <w:r>
+              <w:rPr>
+                <w:b w:val="0"/>
+              </w:rPr>
+              <w:t>Приозерский район, Ленинградская область (+ корректировка ставок для населённых пунктов)</w:t>
+            </w:r>
+          </w:p>
+        </w:tc>
+      </w:tr>
+      <w:tr>
+        <w:tc>
+          <w:tcPr>
+            <w:tcW w:type="dxa" w:w="4320"/>
+          </w:tcPr>
+          <w:p>
+            <w:r/>
+            <w:r>
+              <w:rPr>
+                <w:b/>
+              </w:rPr>
+              <w:t>Стратегия</w:t>
+            </w:r>
+          </w:p>
+        </w:tc>
+        <w:tc>
+          <w:tcPr>
+            <w:tcW w:type="dxa" w:w="4320"/>
+          </w:tcPr>
+          <w:p>
+            <w:r/>
+            <w:r>
+              <w:rPr>
+                <w:b w:val="0"/>
+              </w:rPr>
+              <w:t>Ручное управление ставками или «Оптимизация конверсий» (если настроены цели в Метрике)</w:t>
+            </w:r>
+          </w:p>
+        </w:tc>
+      </w:tr>
+      <w:tr>
+        <w:tc>
+          <w:tcPr>
+            <w:tcW w:type="dxa" w:w="4320"/>
+          </w:tcPr>
+          <w:p>
+            <w:r/>
+            <w:r>
+              <w:rPr>
+                <w:b/>
+              </w:rPr>
+              <w:t>Бюджет</w:t>
+            </w:r>
+          </w:p>
+        </w:tc>
+        <w:tc>
+          <w:tcPr>
+            <w:tcW w:type="dxa" w:w="4320"/>
+          </w:tcPr>
+          <w:p>
+            <w:r/>
+            <w:r>
+              <w:rPr>
+                <w:b w:val="0"/>
+              </w:rPr>
+              <w:t>На уровне кампании; для старта группы — от 300–500 ₽/день на тест (настраивается вручную)</w:t>
+            </w:r>
+          </w:p>
+        </w:tc>
+      </w:tr>
+    </w:tbl>
+    <w:p/>
+    <w:p>
+      <w:pPr>
+        <w:pStyle w:val="Heading2"/>
+      </w:pPr>
+      <w:r>
+        <w:t>UTM-метки (единые для группы)</w:t>
       </w:r>
     </w:p>
     <w:p>
       <w:r>
-        <w:t>**Отдельная кампания с оплатой за конверсии:** см. [`termopaneli-priozersky-campaign-cpa.md`](termopaneli-priozersky-campaign-cpa.md) (стратегия «Максимум конверсий», CPA, UTM `termopaneli_priozersk_cpa`).</w:t>
+        <w:rPr>
+          <w:rFonts w:ascii="Consolas" w:hAnsi="Consolas"/>
+          <w:sz w:val="18"/>
+        </w:rPr>
+        <w:t>https://marmara-pro.ru/termo?utm_source=yandex&amp;utm_medium=cpc&amp;utm_campaign=termopaneli&amp;utm_content=priozersky&amp;utm_term={keyword}</w:t>
       </w:r>
     </w:p>
     <w:p>
+      <w:pPr/>
       <w:r>
-        <w:t>**Бренд:** в объявлениях и названиях кампаний — только **КлинкерПрофи** (не Marmara PRO / «Мармара Про»).</w:t>
+        <w:rPr>
+          <w:b w:val="0"/>
+        </w:rPr>
+        <w:t xml:space="preserve">В Директе: </w:t>
+      </w:r>
+      <w:r>
+        <w:rPr>
+          <w:b/>
+        </w:rPr>
+        <w:t>Настройки кампании → URL-параметры</w:t>
+      </w:r>
+      <w:r>
+        <w:rPr>
+          <w:b w:val="0"/>
+        </w:rPr>
+        <w:t xml:space="preserve"> или в каждом объявлении в поле «Ссылка».</w:t>
+      </w:r>
+    </w:p>
+    <w:p>
+      <w:pPr>
+        <w:pStyle w:val="Heading1"/>
+      </w:pPr>
+      <w:r>
+        <w:t>2. Геотargeting</w:t>
+      </w:r>
+    </w:p>
+    <w:p>
+      <w:pPr/>
+      <w:r>
+        <w:rPr>
+          <w:b/>
+        </w:rPr>
+        <w:t>Основной регион показа:</w:t>
+      </w:r>
+      <w:r>
+        <w:rPr>
+          <w:b w:val="0"/>
+        </w:rPr>
+        <w:t xml:space="preserve"> Приозерский район, Ленинградская область.</w:t>
+      </w:r>
+    </w:p>
+    <w:p>
+      <w:pPr/>
+      <w:r>
+        <w:rPr>
+          <w:b/>
+        </w:rPr>
+        <w:t>Населённые пункты для повышения ставок (+20…+40 %):</w:t>
+      </w:r>
+    </w:p>
+    <w:tbl>
+      <w:tblPr>
+        <w:tblStyle w:val="TableGrid"/>
+        <w:tblW w:type="auto" w:w="0"/>
+        <w:tblLook w:firstColumn="1" w:firstRow="1" w:lastColumn="0" w:lastRow="0" w:noHBand="0" w:noVBand="1" w:val="04A0"/>
+      </w:tblPr>
+      <w:tblGrid>
+        <w:gridCol w:w="4320"/>
+        <w:gridCol w:w="4320"/>
+      </w:tblGrid>
+      <w:tr>
+        <w:tc>
+          <w:tcPr>
+            <w:tcW w:type="dxa" w:w="4320"/>
+          </w:tcPr>
+          <w:p>
+            <w:r>
+              <w:rPr>
+                <w:b/>
+              </w:rPr>
+            </w:r>
+            <w:r>
+              <w:rPr>
+                <w:b/>
+              </w:rPr>
+              <w:t>Населённый пункт</w:t>
+            </w:r>
+          </w:p>
+        </w:tc>
+        <w:tc>
+          <w:tcPr>
+            <w:tcW w:type="dxa" w:w="4320"/>
+          </w:tcPr>
+          <w:p>
+            <w:r>
+              <w:rPr>
+                <w:b/>
+              </w:rPr>
+            </w:r>
+            <w:r>
+              <w:rPr>
+                <w:b/>
+              </w:rPr>
+              <w:t>Примечание</w:t>
+            </w:r>
+          </w:p>
+        </w:tc>
+      </w:tr>
+      <w:tr>
+        <w:tc>
+          <w:tcPr>
+            <w:tcW w:type="dxa" w:w="4320"/>
+          </w:tcPr>
+          <w:p>
+            <w:r/>
+            <w:r>
+              <w:rPr>
+                <w:b w:val="0"/>
+              </w:rPr>
+              <w:t>Приозерск</w:t>
+            </w:r>
+          </w:p>
+        </w:tc>
+        <w:tc>
+          <w:tcPr>
+            <w:tcW w:type="dxa" w:w="4320"/>
+          </w:tcPr>
+          <w:p>
+            <w:r/>
+            <w:r>
+              <w:rPr>
+                <w:b w:val="0"/>
+              </w:rPr>
+              <w:t>Административный центр района</w:t>
+            </w:r>
+          </w:p>
+        </w:tc>
+      </w:tr>
+      <w:tr>
+        <w:tc>
+          <w:tcPr>
+            <w:tcW w:type="dxa" w:w="4320"/>
+          </w:tcPr>
+          <w:p>
+            <w:r/>
+            <w:r>
+              <w:rPr>
+                <w:b w:val="0"/>
+              </w:rPr>
+              <w:t>Сосново</w:t>
+            </w:r>
+          </w:p>
+        </w:tc>
+        <w:tc>
+          <w:tcPr>
+            <w:tcW w:type="dxa" w:w="4320"/>
+          </w:tcPr>
+          <w:p>
+            <w:r/>
+            <w:r>
+              <w:rPr>
+                <w:b w:val="0"/>
+              </w:rPr>
+              <w:t>Крупный посёлок, дачное строительство</w:t>
+            </w:r>
+          </w:p>
+        </w:tc>
+      </w:tr>
+      <w:tr>
+        <w:tc>
+          <w:tcPr>
+            <w:tcW w:type="dxa" w:w="4320"/>
+          </w:tcPr>
+          <w:p>
+            <w:r/>
+            <w:r>
+              <w:rPr>
+                <w:b w:val="0"/>
+              </w:rPr>
+              <w:t>Кузнечное</w:t>
+            </w:r>
+          </w:p>
+        </w:tc>
+        <w:tc>
+          <w:tcPr>
+            <w:tcW w:type="dxa" w:w="4320"/>
+          </w:tcPr>
+          <w:p>
+            <w:r/>
+          </w:p>
+        </w:tc>
+      </w:tr>
+      <w:tr>
+        <w:tc>
+          <w:tcPr>
+            <w:tcW w:type="dxa" w:w="4320"/>
+          </w:tcPr>
+          <w:p>
+            <w:r/>
+            <w:r>
+              <w:rPr>
+                <w:b w:val="0"/>
+              </w:rPr>
+              <w:t>Мельниково</w:t>
+            </w:r>
+          </w:p>
+        </w:tc>
+        <w:tc>
+          <w:tcPr>
+            <w:tcW w:type="dxa" w:w="4320"/>
+          </w:tcPr>
+          <w:p>
+            <w:r/>
+          </w:p>
+        </w:tc>
+      </w:tr>
+      <w:tr>
+        <w:tc>
+          <w:tcPr>
+            <w:tcW w:type="dxa" w:w="4320"/>
+          </w:tcPr>
+          <w:p>
+            <w:r/>
+            <w:r>
+              <w:rPr>
+                <w:b w:val="0"/>
+              </w:rPr>
+              <w:t>Лесогорский</w:t>
+            </w:r>
+          </w:p>
+        </w:tc>
+        <w:tc>
+          <w:tcPr>
+            <w:tcW w:type="dxa" w:w="4320"/>
+          </w:tcPr>
+          <w:p>
+            <w:r/>
+          </w:p>
+        </w:tc>
+      </w:tr>
+      <w:tr>
+        <w:tc>
+          <w:tcPr>
+            <w:tcW w:type="dxa" w:w="4320"/>
+          </w:tcPr>
+          <w:p>
+            <w:r/>
+            <w:r>
+              <w:rPr>
+                <w:b w:val="0"/>
+              </w:rPr>
+              <w:t>Ромашки</w:t>
+            </w:r>
+          </w:p>
+        </w:tc>
+        <w:tc>
+          <w:tcPr>
+            <w:tcW w:type="dxa" w:w="4320"/>
+          </w:tcPr>
+          <w:p>
+            <w:r/>
+            <w:r>
+              <w:rPr>
+                <w:b w:val="0"/>
+              </w:rPr>
+              <w:t>Курортная зона, частное строительство</w:t>
+            </w:r>
+          </w:p>
+        </w:tc>
+      </w:tr>
+      <w:tr>
+        <w:tc>
+          <w:tcPr>
+            <w:tcW w:type="dxa" w:w="4320"/>
+          </w:tcPr>
+          <w:p>
+            <w:r/>
+            <w:r>
+              <w:rPr>
+                <w:b w:val="0"/>
+              </w:rPr>
+              <w:t>Синявино</w:t>
+            </w:r>
+          </w:p>
+        </w:tc>
+        <w:tc>
+          <w:tcPr>
+            <w:tcW w:type="dxa" w:w="4320"/>
+          </w:tcPr>
+          <w:p>
+            <w:r/>
+          </w:p>
+        </w:tc>
+      </w:tr>
+    </w:tbl>
+    <w:p/>
+    <w:p>
+      <w:pPr/>
+      <w:r>
+        <w:rPr>
+          <w:b/>
+        </w:rPr>
+        <w:t>Корректировка ставок для мобильных:</w:t>
+      </w:r>
+      <w:r>
+        <w:rPr>
+          <w:b w:val="0"/>
+        </w:rPr>
+        <w:t xml:space="preserve"> +10…+15 % (звонки с телефона — основной канал).</w:t>
+      </w:r>
+    </w:p>
+    <w:p>
+      <w:pPr>
+        <w:ind w:left="360"/>
+      </w:pPr>
+      <w:r>
+        <w:rPr>
+          <w:b w:val="0"/>
+          <w:i/>
+        </w:rPr>
+        <w:t xml:space="preserve">Завод и склад — </w:t>
+      </w:r>
+      <w:r>
+        <w:rPr>
+          <w:b/>
+          <w:i/>
+        </w:rPr>
+        <w:t>г. Выборг</w:t>
+      </w:r>
+      <w:r>
+        <w:rPr>
+          <w:b w:val="0"/>
+          <w:i/>
+        </w:rPr>
+        <w:t xml:space="preserve"> (~80 км от Приозерска). В объявлениях акцент на «собственное производство в Ленобласти» и «доставка по области», без обещания бесплатной доставки в Приозерский район (в FAQ бесплатная доставка указана для Выборгского района).</w:t>
+      </w:r>
+    </w:p>
+    <w:p>
+      <w:pPr>
+        <w:pStyle w:val="Heading1"/>
+      </w:pPr>
+      <w:r>
+        <w:t>3. Ключевые фразы</w:t>
+      </w:r>
+    </w:p>
+    <w:p>
+      <w:pPr/>
+      <w:r>
+        <w:rPr>
+          <w:b w:val="0"/>
+        </w:rPr>
+        <w:t>Файл для импорта: termopaneli-priozersky-keywords.csv</w:t>
       </w:r>
     </w:p>
     <w:p>
@@ -30,70 +742,1033 @@
         <w:pStyle w:val="Heading2"/>
       </w:pPr>
       <w:r>
-        <w:t>Параметры кампании</w:t>
+        <w:t>Группа «Коммерческие — гео»</w:t>
+      </w:r>
+    </w:p>
+    <w:tbl>
+      <w:tblPr>
+        <w:tblStyle w:val="TableGrid"/>
+        <w:tblW w:type="auto" w:w="0"/>
+        <w:tblLook w:firstColumn="1" w:firstRow="1" w:lastColumn="0" w:lastRow="0" w:noHBand="0" w:noVBand="1" w:val="04A0"/>
+      </w:tblPr>
+      <w:tblGrid>
+        <w:gridCol w:w="4320"/>
+        <w:gridCol w:w="4320"/>
+      </w:tblGrid>
+      <w:tr>
+        <w:tc>
+          <w:tcPr>
+            <w:tcW w:type="dxa" w:w="4320"/>
+          </w:tcPr>
+          <w:p>
+            <w:r>
+              <w:rPr>
+                <w:b/>
+              </w:rPr>
+            </w:r>
+            <w:r>
+              <w:rPr>
+                <w:b/>
+              </w:rPr>
+              <w:t>Ключевая фраза</w:t>
+            </w:r>
+          </w:p>
+        </w:tc>
+        <w:tc>
+          <w:tcPr>
+            <w:tcW w:type="dxa" w:w="4320"/>
+          </w:tcPr>
+          <w:p>
+            <w:r>
+              <w:rPr>
+                <w:b/>
+              </w:rPr>
+            </w:r>
+            <w:r>
+              <w:rPr>
+                <w:b/>
+              </w:rPr>
+              <w:t>Тип</w:t>
+            </w:r>
+          </w:p>
+        </w:tc>
+      </w:tr>
+      <w:tr>
+        <w:tc>
+          <w:tcPr>
+            <w:tcW w:type="dxa" w:w="4320"/>
+          </w:tcPr>
+          <w:p>
+            <w:r/>
+            <w:r>
+              <w:rPr>
+                <w:b w:val="0"/>
+              </w:rPr>
+              <w:t>термопанели приозерск</w:t>
+            </w:r>
+          </w:p>
+        </w:tc>
+        <w:tc>
+          <w:tcPr>
+            <w:tcW w:type="dxa" w:w="4320"/>
+          </w:tcPr>
+          <w:p>
+            <w:r/>
+            <w:r>
+              <w:rPr>
+                <w:b w:val="0"/>
+              </w:rPr>
+              <w:t>фразовое</w:t>
+            </w:r>
+          </w:p>
+        </w:tc>
+      </w:tr>
+      <w:tr>
+        <w:tc>
+          <w:tcPr>
+            <w:tcW w:type="dxa" w:w="4320"/>
+          </w:tcPr>
+          <w:p>
+            <w:r/>
+            <w:r>
+              <w:rPr>
+                <w:b w:val="0"/>
+              </w:rPr>
+              <w:t>термопанели приозерский район</w:t>
+            </w:r>
+          </w:p>
+        </w:tc>
+        <w:tc>
+          <w:tcPr>
+            <w:tcW w:type="dxa" w:w="4320"/>
+          </w:tcPr>
+          <w:p>
+            <w:r/>
+            <w:r>
+              <w:rPr>
+                <w:b w:val="0"/>
+              </w:rPr>
+              <w:t>фразовое</w:t>
+            </w:r>
+          </w:p>
+        </w:tc>
+      </w:tr>
+      <w:tr>
+        <w:tc>
+          <w:tcPr>
+            <w:tcW w:type="dxa" w:w="4320"/>
+          </w:tcPr>
+          <w:p>
+            <w:r/>
+            <w:r>
+              <w:rPr>
+                <w:b w:val="0"/>
+              </w:rPr>
+              <w:t>купить термопанели приозерск</w:t>
+            </w:r>
+          </w:p>
+        </w:tc>
+        <w:tc>
+          <w:tcPr>
+            <w:tcW w:type="dxa" w:w="4320"/>
+          </w:tcPr>
+          <w:p>
+            <w:r/>
+            <w:r>
+              <w:rPr>
+                <w:b w:val="0"/>
+              </w:rPr>
+              <w:t>фразовое</w:t>
+            </w:r>
+          </w:p>
+        </w:tc>
+      </w:tr>
+      <w:tr>
+        <w:tc>
+          <w:tcPr>
+            <w:tcW w:type="dxa" w:w="4320"/>
+          </w:tcPr>
+          <w:p>
+            <w:r/>
+            <w:r>
+              <w:rPr>
+                <w:b w:val="0"/>
+              </w:rPr>
+              <w:t>термопанели сосново</w:t>
+            </w:r>
+          </w:p>
+        </w:tc>
+        <w:tc>
+          <w:tcPr>
+            <w:tcW w:type="dxa" w:w="4320"/>
+          </w:tcPr>
+          <w:p>
+            <w:r/>
+            <w:r>
+              <w:rPr>
+                <w:b w:val="0"/>
+              </w:rPr>
+              <w:t>фразовое</w:t>
+            </w:r>
+          </w:p>
+        </w:tc>
+      </w:tr>
+      <w:tr>
+        <w:tc>
+          <w:tcPr>
+            <w:tcW w:type="dxa" w:w="4320"/>
+          </w:tcPr>
+          <w:p>
+            <w:r/>
+            <w:r>
+              <w:rPr>
+                <w:b w:val="0"/>
+              </w:rPr>
+              <w:t>термопанели кузнечное</w:t>
+            </w:r>
+          </w:p>
+        </w:tc>
+        <w:tc>
+          <w:tcPr>
+            <w:tcW w:type="dxa" w:w="4320"/>
+          </w:tcPr>
+          <w:p>
+            <w:r/>
+            <w:r>
+              <w:rPr>
+                <w:b w:val="0"/>
+              </w:rPr>
+              <w:t>фразовое</w:t>
+            </w:r>
+          </w:p>
+        </w:tc>
+      </w:tr>
+      <w:tr>
+        <w:tc>
+          <w:tcPr>
+            <w:tcW w:type="dxa" w:w="4320"/>
+          </w:tcPr>
+          <w:p>
+            <w:r/>
+            <w:r>
+              <w:rPr>
+                <w:b w:val="0"/>
+              </w:rPr>
+              <w:t>фасадные термопанели приозерск</w:t>
+            </w:r>
+          </w:p>
+        </w:tc>
+        <w:tc>
+          <w:tcPr>
+            <w:tcW w:type="dxa" w:w="4320"/>
+          </w:tcPr>
+          <w:p>
+            <w:r/>
+            <w:r>
+              <w:rPr>
+                <w:b w:val="0"/>
+              </w:rPr>
+              <w:t>фразовое</w:t>
+            </w:r>
+          </w:p>
+        </w:tc>
+      </w:tr>
+      <w:tr>
+        <w:tc>
+          <w:tcPr>
+            <w:tcW w:type="dxa" w:w="4320"/>
+          </w:tcPr>
+          <w:p>
+            <w:r/>
+            <w:r>
+              <w:rPr>
+                <w:b w:val="0"/>
+              </w:rPr>
+              <w:t>термопанели для дома приозерск</w:t>
+            </w:r>
+          </w:p>
+        </w:tc>
+        <w:tc>
+          <w:tcPr>
+            <w:tcW w:type="dxa" w:w="4320"/>
+          </w:tcPr>
+          <w:p>
+            <w:r/>
+            <w:r>
+              <w:rPr>
+                <w:b w:val="0"/>
+              </w:rPr>
+              <w:t>фразовое</w:t>
+            </w:r>
+          </w:p>
+        </w:tc>
+      </w:tr>
+      <w:tr>
+        <w:tc>
+          <w:tcPr>
+            <w:tcW w:type="dxa" w:w="4320"/>
+          </w:tcPr>
+          <w:p>
+            <w:r/>
+            <w:r>
+              <w:rPr>
+                <w:b w:val="0"/>
+              </w:rPr>
+              <w:t>термопанели с клинкером приозерск</w:t>
+            </w:r>
+          </w:p>
+        </w:tc>
+        <w:tc>
+          <w:tcPr>
+            <w:tcW w:type="dxa" w:w="4320"/>
+          </w:tcPr>
+          <w:p>
+            <w:r/>
+            <w:r>
+              <w:rPr>
+                <w:b w:val="0"/>
+              </w:rPr>
+              <w:t>фразовое</w:t>
+            </w:r>
+          </w:p>
+        </w:tc>
+      </w:tr>
+      <w:tr>
+        <w:tc>
+          <w:tcPr>
+            <w:tcW w:type="dxa" w:w="4320"/>
+          </w:tcPr>
+          <w:p>
+            <w:r/>
+            <w:r>
+              <w:rPr>
+                <w:b w:val="0"/>
+              </w:rPr>
+              <w:t>клинкерные термопанели приозерский район</w:t>
+            </w:r>
+          </w:p>
+        </w:tc>
+        <w:tc>
+          <w:tcPr>
+            <w:tcW w:type="dxa" w:w="4320"/>
+          </w:tcPr>
+          <w:p>
+            <w:r/>
+            <w:r>
+              <w:rPr>
+                <w:b w:val="0"/>
+              </w:rPr>
+              <w:t>фразовое</w:t>
+            </w:r>
+          </w:p>
+        </w:tc>
+      </w:tr>
+      <w:tr>
+        <w:tc>
+          <w:tcPr>
+            <w:tcW w:type="dxa" w:w="4320"/>
+          </w:tcPr>
+          <w:p>
+            <w:r/>
+            <w:r>
+              <w:rPr>
+                <w:b w:val="0"/>
+              </w:rPr>
+              <w:t>термопанели ленинградская область купить</w:t>
+            </w:r>
+          </w:p>
+        </w:tc>
+        <w:tc>
+          <w:tcPr>
+            <w:tcW w:type="dxa" w:w="4320"/>
+          </w:tcPr>
+          <w:p>
+            <w:r/>
+            <w:r>
+              <w:rPr>
+                <w:b w:val="0"/>
+              </w:rPr>
+              <w:t>фразовое</w:t>
+            </w:r>
+          </w:p>
+        </w:tc>
+      </w:tr>
+    </w:tbl>
+    <w:p/>
+    <w:p>
+      <w:pPr>
+        <w:pStyle w:val="Heading2"/>
+      </w:pPr>
+      <w:r>
+        <w:t>Группа «Коммерческие — общие»</w:t>
+      </w:r>
+    </w:p>
+    <w:tbl>
+      <w:tblPr>
+        <w:tblStyle w:val="TableGrid"/>
+        <w:tblW w:type="auto" w:w="0"/>
+        <w:tblLook w:firstColumn="1" w:firstRow="1" w:lastColumn="0" w:lastRow="0" w:noHBand="0" w:noVBand="1" w:val="04A0"/>
+      </w:tblPr>
+      <w:tblGrid>
+        <w:gridCol w:w="4320"/>
+        <w:gridCol w:w="4320"/>
+      </w:tblGrid>
+      <w:tr>
+        <w:tc>
+          <w:tcPr>
+            <w:tcW w:type="dxa" w:w="4320"/>
+          </w:tcPr>
+          <w:p>
+            <w:r>
+              <w:rPr>
+                <w:b/>
+              </w:rPr>
+            </w:r>
+            <w:r>
+              <w:rPr>
+                <w:b/>
+              </w:rPr>
+              <w:t>Ключевая фраза</w:t>
+            </w:r>
+          </w:p>
+        </w:tc>
+        <w:tc>
+          <w:tcPr>
+            <w:tcW w:type="dxa" w:w="4320"/>
+          </w:tcPr>
+          <w:p>
+            <w:r>
+              <w:rPr>
+                <w:b/>
+              </w:rPr>
+            </w:r>
+            <w:r>
+              <w:rPr>
+                <w:b/>
+              </w:rPr>
+              <w:t>Тип</w:t>
+            </w:r>
+          </w:p>
+        </w:tc>
+      </w:tr>
+      <w:tr>
+        <w:tc>
+          <w:tcPr>
+            <w:tcW w:type="dxa" w:w="4320"/>
+          </w:tcPr>
+          <w:p>
+            <w:r/>
+            <w:r>
+              <w:rPr>
+                <w:b w:val="0"/>
+              </w:rPr>
+              <w:t>термопанели с клинкерной плиткой</w:t>
+            </w:r>
+          </w:p>
+        </w:tc>
+        <w:tc>
+          <w:tcPr>
+            <w:tcW w:type="dxa" w:w="4320"/>
+          </w:tcPr>
+          <w:p>
+            <w:r/>
+            <w:r>
+              <w:rPr>
+                <w:b w:val="0"/>
+              </w:rPr>
+              <w:t>фразовое</w:t>
+            </w:r>
+          </w:p>
+        </w:tc>
+      </w:tr>
+      <w:tr>
+        <w:tc>
+          <w:tcPr>
+            <w:tcW w:type="dxa" w:w="4320"/>
+          </w:tcPr>
+          <w:p>
+            <w:r/>
+            <w:r>
+              <w:rPr>
+                <w:b w:val="0"/>
+              </w:rPr>
+              <w:t>фасадные термопанели с клинкером</w:t>
+            </w:r>
+          </w:p>
+        </w:tc>
+        <w:tc>
+          <w:tcPr>
+            <w:tcW w:type="dxa" w:w="4320"/>
+          </w:tcPr>
+          <w:p>
+            <w:r/>
+            <w:r>
+              <w:rPr>
+                <w:b w:val="0"/>
+              </w:rPr>
+              <w:t>фразовое</w:t>
+            </w:r>
+          </w:p>
+        </w:tc>
+      </w:tr>
+      <w:tr>
+        <w:tc>
+          <w:tcPr>
+            <w:tcW w:type="dxa" w:w="4320"/>
+          </w:tcPr>
+          <w:p>
+            <w:r/>
+            <w:r>
+              <w:rPr>
+                <w:b w:val="0"/>
+              </w:rPr>
+              <w:t>клинкерные термопанели купить</w:t>
+            </w:r>
+          </w:p>
+        </w:tc>
+        <w:tc>
+          <w:tcPr>
+            <w:tcW w:type="dxa" w:w="4320"/>
+          </w:tcPr>
+          <w:p>
+            <w:r/>
+            <w:r>
+              <w:rPr>
+                <w:b w:val="0"/>
+              </w:rPr>
+              <w:t>фразовое</w:t>
+            </w:r>
+          </w:p>
+        </w:tc>
+      </w:tr>
+      <w:tr>
+        <w:tc>
+          <w:tcPr>
+            <w:tcW w:type="dxa" w:w="4320"/>
+          </w:tcPr>
+          <w:p>
+            <w:r/>
+            <w:r>
+              <w:rPr>
+                <w:b w:val="0"/>
+              </w:rPr>
+              <w:t>термопанели с клинкером</w:t>
+            </w:r>
+          </w:p>
+        </w:tc>
+        <w:tc>
+          <w:tcPr>
+            <w:tcW w:type="dxa" w:w="4320"/>
+          </w:tcPr>
+          <w:p>
+            <w:r/>
+            <w:r>
+              <w:rPr>
+                <w:b w:val="0"/>
+              </w:rPr>
+              <w:t>фразовое</w:t>
+            </w:r>
+          </w:p>
+        </w:tc>
+      </w:tr>
+      <w:tr>
+        <w:tc>
+          <w:tcPr>
+            <w:tcW w:type="dxa" w:w="4320"/>
+          </w:tcPr>
+          <w:p>
+            <w:r/>
+            <w:r>
+              <w:rPr>
+                <w:b w:val="0"/>
+              </w:rPr>
+              <w:t>термопанели для фасада дома</w:t>
+            </w:r>
+          </w:p>
+        </w:tc>
+        <w:tc>
+          <w:tcPr>
+            <w:tcW w:type="dxa" w:w="4320"/>
+          </w:tcPr>
+          <w:p>
+            <w:r/>
+            <w:r>
+              <w:rPr>
+                <w:b w:val="0"/>
+              </w:rPr>
+              <w:t>фразовое</w:t>
+            </w:r>
+          </w:p>
+        </w:tc>
+      </w:tr>
+      <w:tr>
+        <w:tc>
+          <w:tcPr>
+            <w:tcW w:type="dxa" w:w="4320"/>
+          </w:tcPr>
+          <w:p>
+            <w:r/>
+            <w:r>
+              <w:rPr>
+                <w:b w:val="0"/>
+              </w:rPr>
+              <w:t>утепление фасада термопанелями</w:t>
+            </w:r>
+          </w:p>
+        </w:tc>
+        <w:tc>
+          <w:tcPr>
+            <w:tcW w:type="dxa" w:w="4320"/>
+          </w:tcPr>
+          <w:p>
+            <w:r/>
+            <w:r>
+              <w:rPr>
+                <w:b w:val="0"/>
+              </w:rPr>
+              <w:t>фразовое</w:t>
+            </w:r>
+          </w:p>
+        </w:tc>
+      </w:tr>
+      <w:tr>
+        <w:tc>
+          <w:tcPr>
+            <w:tcW w:type="dxa" w:w="4320"/>
+          </w:tcPr>
+          <w:p>
+            <w:r/>
+            <w:r>
+              <w:rPr>
+                <w:b w:val="0"/>
+              </w:rPr>
+              <w:t>термопанели пенополиуретан</w:t>
+            </w:r>
+          </w:p>
+        </w:tc>
+        <w:tc>
+          <w:tcPr>
+            <w:tcW w:type="dxa" w:w="4320"/>
+          </w:tcPr>
+          <w:p>
+            <w:r/>
+            <w:r>
+              <w:rPr>
+                <w:b w:val="0"/>
+              </w:rPr>
+              <w:t>фразовое</w:t>
+            </w:r>
+          </w:p>
+        </w:tc>
+      </w:tr>
+      <w:tr>
+        <w:tc>
+          <w:tcPr>
+            <w:tcW w:type="dxa" w:w="4320"/>
+          </w:tcPr>
+          <w:p>
+            <w:r/>
+            <w:r>
+              <w:rPr>
+                <w:b w:val="0"/>
+              </w:rPr>
+              <w:t>термопанели пенополистирол</w:t>
+            </w:r>
+          </w:p>
+        </w:tc>
+        <w:tc>
+          <w:tcPr>
+            <w:tcW w:type="dxa" w:w="4320"/>
+          </w:tcPr>
+          <w:p>
+            <w:r/>
+            <w:r>
+              <w:rPr>
+                <w:b w:val="0"/>
+              </w:rPr>
+              <w:t>фразовое</w:t>
+            </w:r>
+          </w:p>
+        </w:tc>
+      </w:tr>
+      <w:tr>
+        <w:tc>
+          <w:tcPr>
+            <w:tcW w:type="dxa" w:w="4320"/>
+          </w:tcPr>
+          <w:p>
+            <w:r/>
+            <w:r>
+              <w:rPr>
+                <w:b w:val="0"/>
+              </w:rPr>
+              <w:t>термопанели производитель</w:t>
+            </w:r>
+          </w:p>
+        </w:tc>
+        <w:tc>
+          <w:tcPr>
+            <w:tcW w:type="dxa" w:w="4320"/>
+          </w:tcPr>
+          <w:p>
+            <w:r/>
+            <w:r>
+              <w:rPr>
+                <w:b w:val="0"/>
+              </w:rPr>
+              <w:t>фразовое</w:t>
+            </w:r>
+          </w:p>
+        </w:tc>
+      </w:tr>
+      <w:tr>
+        <w:tc>
+          <w:tcPr>
+            <w:tcW w:type="dxa" w:w="4320"/>
+          </w:tcPr>
+          <w:p>
+            <w:r/>
+            <w:r>
+              <w:rPr>
+                <w:b w:val="0"/>
+              </w:rPr>
+              <w:t>термопанели выборг</w:t>
+            </w:r>
+          </w:p>
+        </w:tc>
+        <w:tc>
+          <w:tcPr>
+            <w:tcW w:type="dxa" w:w="4320"/>
+          </w:tcPr>
+          <w:p>
+            <w:r/>
+            <w:r>
+              <w:rPr>
+                <w:b w:val="0"/>
+              </w:rPr>
+              <w:t>фразовое</w:t>
+            </w:r>
+          </w:p>
+        </w:tc>
+      </w:tr>
+      <w:tr>
+        <w:tc>
+          <w:tcPr>
+            <w:tcW w:type="dxa" w:w="4320"/>
+          </w:tcPr>
+          <w:p>
+            <w:r/>
+            <w:r>
+              <w:rPr>
+                <w:b w:val="0"/>
+              </w:rPr>
+              <w:t>облицовка фасада термопанелями</w:t>
+            </w:r>
+          </w:p>
+        </w:tc>
+        <w:tc>
+          <w:tcPr>
+            <w:tcW w:type="dxa" w:w="4320"/>
+          </w:tcPr>
+          <w:p>
+            <w:r/>
+            <w:r>
+              <w:rPr>
+                <w:b w:val="0"/>
+              </w:rPr>
+              <w:t>фразовое</w:t>
+            </w:r>
+          </w:p>
+        </w:tc>
+      </w:tr>
+      <w:tr>
+        <w:tc>
+          <w:tcPr>
+            <w:tcW w:type="dxa" w:w="4320"/>
+          </w:tcPr>
+          <w:p>
+            <w:r/>
+            <w:r>
+              <w:rPr>
+                <w:b w:val="0"/>
+              </w:rPr>
+              <w:t>фасадные панели с утеплителем</w:t>
+            </w:r>
+          </w:p>
+        </w:tc>
+        <w:tc>
+          <w:tcPr>
+            <w:tcW w:type="dxa" w:w="4320"/>
+          </w:tcPr>
+          <w:p>
+            <w:r/>
+            <w:r>
+              <w:rPr>
+                <w:b w:val="0"/>
+              </w:rPr>
+              <w:t>фразовое</w:t>
+            </w:r>
+          </w:p>
+        </w:tc>
+      </w:tr>
+      <w:tr>
+        <w:tc>
+          <w:tcPr>
+            <w:tcW w:type="dxa" w:w="4320"/>
+          </w:tcPr>
+          <w:p>
+            <w:r/>
+            <w:r>
+              <w:rPr>
+                <w:b w:val="0"/>
+              </w:rPr>
+              <w:t>термопанели под кирпич</w:t>
+            </w:r>
+          </w:p>
+        </w:tc>
+        <w:tc>
+          <w:tcPr>
+            <w:tcW w:type="dxa" w:w="4320"/>
+          </w:tcPr>
+          <w:p>
+            <w:r/>
+            <w:r>
+              <w:rPr>
+                <w:b w:val="0"/>
+              </w:rPr>
+              <w:t>фразовое</w:t>
+            </w:r>
+          </w:p>
+        </w:tc>
+      </w:tr>
+      <w:tr>
+        <w:tc>
+          <w:tcPr>
+            <w:tcW w:type="dxa" w:w="4320"/>
+          </w:tcPr>
+          <w:p>
+            <w:r/>
+            <w:r>
+              <w:rPr>
+                <w:b w:val="0"/>
+              </w:rPr>
+              <w:t>термопанели клинкерный кирпич</w:t>
+            </w:r>
+          </w:p>
+        </w:tc>
+        <w:tc>
+          <w:tcPr>
+            <w:tcW w:type="dxa" w:w="4320"/>
+          </w:tcPr>
+          <w:p>
+            <w:r/>
+            <w:r>
+              <w:rPr>
+                <w:b w:val="0"/>
+              </w:rPr>
+              <w:t>фразовое</w:t>
+            </w:r>
+          </w:p>
+        </w:tc>
+      </w:tr>
+    </w:tbl>
+    <w:p/>
+    <w:p>
+      <w:pPr>
+        <w:pStyle w:val="Heading2"/>
+      </w:pPr>
+      <w:r>
+        <w:t>Широкие (осторожно, с минус-словами)</w:t>
+      </w:r>
+    </w:p>
+    <w:tbl>
+      <w:tblPr>
+        <w:tblStyle w:val="TableGrid"/>
+        <w:tblW w:type="auto" w:w="0"/>
+        <w:tblLook w:firstColumn="1" w:firstRow="1" w:lastColumn="0" w:lastRow="0" w:noHBand="0" w:noVBand="1" w:val="04A0"/>
+      </w:tblPr>
+      <w:tblGrid>
+        <w:gridCol w:w="4320"/>
+        <w:gridCol w:w="4320"/>
+      </w:tblGrid>
+      <w:tr>
+        <w:tc>
+          <w:tcPr>
+            <w:tcW w:type="dxa" w:w="4320"/>
+          </w:tcPr>
+          <w:p>
+            <w:r>
+              <w:rPr>
+                <w:b/>
+              </w:rPr>
+            </w:r>
+            <w:r>
+              <w:rPr>
+                <w:b/>
+              </w:rPr>
+              <w:t>Ключевая фраза</w:t>
+            </w:r>
+          </w:p>
+        </w:tc>
+        <w:tc>
+          <w:tcPr>
+            <w:tcW w:type="dxa" w:w="4320"/>
+          </w:tcPr>
+          <w:p>
+            <w:r>
+              <w:rPr>
+                <w:b/>
+              </w:rPr>
+            </w:r>
+            <w:r>
+              <w:rPr>
+                <w:b/>
+              </w:rPr>
+              <w:t>Тип</w:t>
+            </w:r>
+          </w:p>
+        </w:tc>
+      </w:tr>
+      <w:tr>
+        <w:tc>
+          <w:tcPr>
+            <w:tcW w:type="dxa" w:w="4320"/>
+          </w:tcPr>
+          <w:p>
+            <w:r/>
+            <w:r>
+              <w:rPr>
+                <w:b w:val="0"/>
+              </w:rPr>
+              <w:t>термопанели</w:t>
+            </w:r>
+          </w:p>
+        </w:tc>
+        <w:tc>
+          <w:tcPr>
+            <w:tcW w:type="dxa" w:w="4320"/>
+          </w:tcPr>
+          <w:p>
+            <w:r/>
+            <w:r>
+              <w:rPr>
+                <w:b w:val="0"/>
+              </w:rPr>
+              <w:t>широкое</w:t>
+            </w:r>
+          </w:p>
+        </w:tc>
+      </w:tr>
+      <w:tr>
+        <w:tc>
+          <w:tcPr>
+            <w:tcW w:type="dxa" w:w="4320"/>
+          </w:tcPr>
+          <w:p>
+            <w:r/>
+            <w:r>
+              <w:rPr>
+                <w:b w:val="0"/>
+              </w:rPr>
+              <w:t>фасадные термопанели</w:t>
+            </w:r>
+          </w:p>
+        </w:tc>
+        <w:tc>
+          <w:tcPr>
+            <w:tcW w:type="dxa" w:w="4320"/>
+          </w:tcPr>
+          <w:p>
+            <w:r/>
+            <w:r>
+              <w:rPr>
+                <w:b w:val="0"/>
+              </w:rPr>
+              <w:t>широкое</w:t>
+            </w:r>
+          </w:p>
+        </w:tc>
+      </w:tr>
+    </w:tbl>
+    <w:p/>
+    <w:p>
+      <w:pPr>
+        <w:pStyle w:val="Heading1"/>
+      </w:pPr>
+      <w:r>
+        <w:t>4. Минус-слова</w:t>
+      </w:r>
+    </w:p>
+    <w:p>
+      <w:pPr/>
+      <w:r>
+        <w:rPr>
+          <w:b/>
+        </w:rPr>
+        <w:t>На уровне кампании (общие):</w:t>
       </w:r>
     </w:p>
     <w:p>
       <w:r>
-        <w:t>| Параметр | Значение |</w:t>
+        <w:rPr>
+          <w:rFonts w:ascii="Consolas" w:hAnsi="Consolas"/>
+          <w:sz w:val="18"/>
+        </w:rPr>
+        <w:t>б/у, бу, авито, olx, алиэкспресс, aliexpress, вакансии, работа, резюме, своими руками, видео, скачать, чертеж, чертежи, схема, инструкция, wiki, википедия, форум, фото, картинки, обои, 3d, модель, бесплатно, даром, дешево, дешёво, китай, китайские, пластиковые, виниловые, сайдинг, металлические, пвх, osb, осб, гараж, забор, потолок, пол, внутри, внутренние, балкон, лоджия, фундамент, цокольный этаж, ремонт квартир, баня, сауна, теплица, хозблок, бытовка, контейнер, строительство многоквартирных</w:t>
+      </w:r>
+    </w:p>
+    <w:p>
+      <w:pPr/>
+      <w:r>
+        <w:rPr>
+          <w:b/>
+        </w:rPr>
+        <w:t>Дополнительно для группы «Приозерский район»:</w:t>
       </w:r>
     </w:p>
     <w:p>
       <w:r>
-        <w:t>|---|---|</w:t>
-      </w:r>
-    </w:p>
-    <w:p>
-      <w:r>
-        <w:t>| **Кампания** | Термопанели (поиск) — существующая или создать по инструкции ниже |</w:t>
-      </w:r>
-    </w:p>
-    <w:p>
-      <w:r>
-        <w:t>| **Название группы** | Приозерский район |</w:t>
-      </w:r>
-    </w:p>
-    <w:p>
-      <w:r>
-        <w:t>| **Тип** | Текстово-графические объявления, поиск |</w:t>
-      </w:r>
-    </w:p>
-    <w:p>
-      <w:r>
-        <w:t>| **Посадочная страница** | `https://marmara-pro.ru/termo` |</w:t>
-      </w:r>
-    </w:p>
-    <w:p>
-      <w:r>
-        <w:t>| **Геотargeting группы** | Приозерский район, Ленинградская область (+ корректировка ставок для населённых пунктов) |</w:t>
-      </w:r>
-    </w:p>
-    <w:p>
-      <w:r>
-        <w:t>| **Стратегия** | Ручное управление ставками или «Оптимизация конверсий» (если настроены цели в Метрике) |</w:t>
-      </w:r>
-    </w:p>
-    <w:p>
-      <w:r>
-        <w:t>| **Бюджет** | На уровне кампании; для старта группы — от 300–500 ₽/день на тест (настраивается вручную) |</w:t>
+        <w:rPr>
+          <w:rFonts w:ascii="Consolas" w:hAnsi="Consolas"/>
+          <w:sz w:val="18"/>
+        </w:rPr>
+        <w:t>москва, московская, спб санкт-петербург петербург, новгород, карелия, финляндия, финский залив, яхта, катер, лодка, причал, мост, дорога, асфальт</w:t>
       </w:r>
     </w:p>
     <w:p>
       <w:pPr>
-        <w:pStyle w:val="Heading3"/>
+        <w:pStyle w:val="Heading1"/>
       </w:pPr>
       <w:r>
-        <w:t>UTM-метки (единые для группы)</w:t>
+        <w:t>5. Объявления</w:t>
       </w:r>
     </w:p>
     <w:p>
+      <w:pPr/>
       <w:r>
-        <w:t>https://marmara-pro.ru/termo?utm_source=yandex&amp;utm_medium=cpc&amp;utm_campaign=termopaneli&amp;utm_content=priozersky&amp;utm_term={keyword}</w:t>
+        <w:rPr>
+          <w:b w:val="0"/>
+        </w:rPr>
+        <w:t>Файл для импорта: termopaneli-priozersky-ads.csv</w:t>
       </w:r>
     </w:p>
     <w:p>
+      <w:pPr>
+        <w:ind w:left="360"/>
+      </w:pPr>
       <w:r>
-        <w:t>В Директе: **Настройки кампании → URL-параметры** или в каждом объявлении в поле «Ссылка».</w:t>
+        <w:rPr>
+          <w:b/>
+          <w:i/>
+        </w:rPr>
+        <w:t>Без указания цен.</w:t>
+      </w:r>
+      <w:r>
+        <w:rPr>
+          <w:b w:val="0"/>
+          <w:i/>
+        </w:rPr>
+        <w:t xml:space="preserve"> Лимиты Яндекс Директа: заголовок 1 — 56 символов, заголовок 2 — 30, текст — 81.</w:t>
       </w:r>
     </w:p>
     <w:p>
@@ -101,72 +1776,1486 @@
         <w:pStyle w:val="Heading2"/>
       </w:pPr>
       <w:r>
-        <w:t>Геотargeting</w:t>
+        <w:t>Объявление 1</w:t>
+      </w:r>
+    </w:p>
+    <w:tbl>
+      <w:tblPr>
+        <w:tblStyle w:val="TableGrid"/>
+        <w:tblW w:type="auto" w:w="0"/>
+        <w:tblLook w:firstColumn="1" w:firstRow="1" w:lastColumn="0" w:lastRow="0" w:noHBand="0" w:noVBand="1" w:val="04A0"/>
+      </w:tblPr>
+      <w:tblGrid>
+        <w:gridCol w:w="2880"/>
+        <w:gridCol w:w="2880"/>
+        <w:gridCol w:w="2880"/>
+      </w:tblGrid>
+      <w:tr>
+        <w:tc>
+          <w:tcPr>
+            <w:tcW w:type="dxa" w:w="2880"/>
+          </w:tcPr>
+          <w:p>
+            <w:r>
+              <w:rPr>
+                <w:b/>
+              </w:rPr>
+            </w:r>
+            <w:r>
+              <w:rPr>
+                <w:b/>
+              </w:rPr>
+              <w:t>Поле</w:t>
+            </w:r>
+          </w:p>
+        </w:tc>
+        <w:tc>
+          <w:tcPr>
+            <w:tcW w:type="dxa" w:w="2880"/>
+          </w:tcPr>
+          <w:p>
+            <w:r>
+              <w:rPr>
+                <w:b/>
+              </w:rPr>
+            </w:r>
+            <w:r>
+              <w:rPr>
+                <w:b/>
+              </w:rPr>
+              <w:t>Текст</w:t>
+            </w:r>
+          </w:p>
+        </w:tc>
+        <w:tc>
+          <w:tcPr>
+            <w:tcW w:type="dxa" w:w="2880"/>
+          </w:tcPr>
+          <w:p>
+            <w:r>
+              <w:rPr>
+                <w:b/>
+              </w:rPr>
+            </w:r>
+            <w:r>
+              <w:rPr>
+                <w:b/>
+              </w:rPr>
+              <w:t>Символов</w:t>
+            </w:r>
+          </w:p>
+        </w:tc>
+      </w:tr>
+      <w:tr>
+        <w:tc>
+          <w:tcPr>
+            <w:tcW w:type="dxa" w:w="2880"/>
+          </w:tcPr>
+          <w:p>
+            <w:r/>
+            <w:r>
+              <w:rPr>
+                <w:b w:val="0"/>
+              </w:rPr>
+              <w:t>Заголовок 1</w:t>
+            </w:r>
+          </w:p>
+        </w:tc>
+        <w:tc>
+          <w:tcPr>
+            <w:tcW w:type="dxa" w:w="2880"/>
+          </w:tcPr>
+          <w:p>
+            <w:r/>
+            <w:r>
+              <w:rPr>
+                <w:b w:val="0"/>
+              </w:rPr>
+              <w:t>Термопанели с клинкером — КлинкерПрофи</w:t>
+            </w:r>
+          </w:p>
+        </w:tc>
+        <w:tc>
+          <w:tcPr>
+            <w:tcW w:type="dxa" w:w="2880"/>
+          </w:tcPr>
+          <w:p>
+            <w:r/>
+            <w:r>
+              <w:rPr>
+                <w:b w:val="0"/>
+              </w:rPr>
+              <w:t>37</w:t>
+            </w:r>
+          </w:p>
+        </w:tc>
+      </w:tr>
+      <w:tr>
+        <w:tc>
+          <w:tcPr>
+            <w:tcW w:type="dxa" w:w="2880"/>
+          </w:tcPr>
+          <w:p>
+            <w:r/>
+            <w:r>
+              <w:rPr>
+                <w:b w:val="0"/>
+              </w:rPr>
+              <w:t>Заголовок 2</w:t>
+            </w:r>
+          </w:p>
+        </w:tc>
+        <w:tc>
+          <w:tcPr>
+            <w:tcW w:type="dxa" w:w="2880"/>
+          </w:tcPr>
+          <w:p>
+            <w:r/>
+            <w:r>
+              <w:rPr>
+                <w:b w:val="0"/>
+              </w:rPr>
+              <w:t>Приозерский район</w:t>
+            </w:r>
+          </w:p>
+        </w:tc>
+        <w:tc>
+          <w:tcPr>
+            <w:tcW w:type="dxa" w:w="2880"/>
+          </w:tcPr>
+          <w:p>
+            <w:r/>
+            <w:r>
+              <w:rPr>
+                <w:b w:val="0"/>
+              </w:rPr>
+              <w:t>17</w:t>
+            </w:r>
+          </w:p>
+        </w:tc>
+      </w:tr>
+      <w:tr>
+        <w:tc>
+          <w:tcPr>
+            <w:tcW w:type="dxa" w:w="2880"/>
+          </w:tcPr>
+          <w:p>
+            <w:r/>
+            <w:r>
+              <w:rPr>
+                <w:b w:val="0"/>
+              </w:rPr>
+              <w:t>Текст</w:t>
+            </w:r>
+          </w:p>
+        </w:tc>
+        <w:tc>
+          <w:tcPr>
+            <w:tcW w:type="dxa" w:w="2880"/>
+          </w:tcPr>
+          <w:p>
+            <w:r/>
+            <w:r>
+              <w:rPr>
+                <w:b w:val="0"/>
+              </w:rPr>
+              <w:t>Утепление и фасад за один этап. Производство в Выборге. Доставка по Ленобласти.</w:t>
+            </w:r>
+          </w:p>
+        </w:tc>
+        <w:tc>
+          <w:tcPr>
+            <w:tcW w:type="dxa" w:w="2880"/>
+          </w:tcPr>
+          <w:p>
+            <w:r/>
+            <w:r>
+              <w:rPr>
+                <w:b w:val="0"/>
+              </w:rPr>
+              <w:t>80</w:t>
+            </w:r>
+          </w:p>
+        </w:tc>
+      </w:tr>
+      <w:tr>
+        <w:tc>
+          <w:tcPr>
+            <w:tcW w:type="dxa" w:w="2880"/>
+          </w:tcPr>
+          <w:p>
+            <w:r/>
+            <w:r>
+              <w:rPr>
+                <w:b w:val="0"/>
+              </w:rPr>
+              <w:t>Отображаемая ссылка</w:t>
+            </w:r>
+          </w:p>
+        </w:tc>
+        <w:tc>
+          <w:tcPr>
+            <w:tcW w:type="dxa" w:w="2880"/>
+          </w:tcPr>
+          <w:p>
+            <w:r/>
+            <w:r>
+              <w:rPr>
+                <w:b w:val="0"/>
+              </w:rPr>
+              <w:t>marmara-pro.ru/termo</w:t>
+            </w:r>
+          </w:p>
+        </w:tc>
+        <w:tc>
+          <w:tcPr>
+            <w:tcW w:type="dxa" w:w="2880"/>
+          </w:tcPr>
+          <w:p>
+            <w:r/>
+          </w:p>
+        </w:tc>
+      </w:tr>
+    </w:tbl>
+    <w:p/>
+    <w:p>
+      <w:pPr>
+        <w:pStyle w:val="Heading2"/>
+      </w:pPr>
+      <w:r>
+        <w:t>Объявление 2</w:t>
+      </w:r>
+    </w:p>
+    <w:tbl>
+      <w:tblPr>
+        <w:tblStyle w:val="TableGrid"/>
+        <w:tblW w:type="auto" w:w="0"/>
+        <w:tblLook w:firstColumn="1" w:firstRow="1" w:lastColumn="0" w:lastRow="0" w:noHBand="0" w:noVBand="1" w:val="04A0"/>
+      </w:tblPr>
+      <w:tblGrid>
+        <w:gridCol w:w="2880"/>
+        <w:gridCol w:w="2880"/>
+        <w:gridCol w:w="2880"/>
+      </w:tblGrid>
+      <w:tr>
+        <w:tc>
+          <w:tcPr>
+            <w:tcW w:type="dxa" w:w="2880"/>
+          </w:tcPr>
+          <w:p>
+            <w:r>
+              <w:rPr>
+                <w:b/>
+              </w:rPr>
+            </w:r>
+            <w:r>
+              <w:rPr>
+                <w:b/>
+              </w:rPr>
+              <w:t>Поле</w:t>
+            </w:r>
+          </w:p>
+        </w:tc>
+        <w:tc>
+          <w:tcPr>
+            <w:tcW w:type="dxa" w:w="2880"/>
+          </w:tcPr>
+          <w:p>
+            <w:r>
+              <w:rPr>
+                <w:b/>
+              </w:rPr>
+            </w:r>
+            <w:r>
+              <w:rPr>
+                <w:b/>
+              </w:rPr>
+              <w:t>Текст</w:t>
+            </w:r>
+          </w:p>
+        </w:tc>
+        <w:tc>
+          <w:tcPr>
+            <w:tcW w:type="dxa" w:w="2880"/>
+          </w:tcPr>
+          <w:p>
+            <w:r>
+              <w:rPr>
+                <w:b/>
+              </w:rPr>
+            </w:r>
+            <w:r>
+              <w:rPr>
+                <w:b/>
+              </w:rPr>
+              <w:t>Символов</w:t>
+            </w:r>
+          </w:p>
+        </w:tc>
+      </w:tr>
+      <w:tr>
+        <w:tc>
+          <w:tcPr>
+            <w:tcW w:type="dxa" w:w="2880"/>
+          </w:tcPr>
+          <w:p>
+            <w:r/>
+            <w:r>
+              <w:rPr>
+                <w:b w:val="0"/>
+              </w:rPr>
+              <w:t>Заголовок 1</w:t>
+            </w:r>
+          </w:p>
+        </w:tc>
+        <w:tc>
+          <w:tcPr>
+            <w:tcW w:type="dxa" w:w="2880"/>
+          </w:tcPr>
+          <w:p>
+            <w:r/>
+            <w:r>
+              <w:rPr>
+                <w:b w:val="0"/>
+              </w:rPr>
+              <w:t>Термопанели для дома в Приозерске</w:t>
+            </w:r>
+          </w:p>
+        </w:tc>
+        <w:tc>
+          <w:tcPr>
+            <w:tcW w:type="dxa" w:w="2880"/>
+          </w:tcPr>
+          <w:p>
+            <w:r/>
+            <w:r>
+              <w:rPr>
+                <w:b w:val="0"/>
+              </w:rPr>
+              <w:t>33</w:t>
+            </w:r>
+          </w:p>
+        </w:tc>
+      </w:tr>
+      <w:tr>
+        <w:tc>
+          <w:tcPr>
+            <w:tcW w:type="dxa" w:w="2880"/>
+          </w:tcPr>
+          <w:p>
+            <w:r/>
+            <w:r>
+              <w:rPr>
+                <w:b w:val="0"/>
+              </w:rPr>
+              <w:t>Заголовок 2</w:t>
+            </w:r>
+          </w:p>
+        </w:tc>
+        <w:tc>
+          <w:tcPr>
+            <w:tcW w:type="dxa" w:w="2880"/>
+          </w:tcPr>
+          <w:p>
+            <w:r/>
+            <w:r>
+              <w:rPr>
+                <w:b w:val="0"/>
+              </w:rPr>
+              <w:t>Собственное производство</w:t>
+            </w:r>
+          </w:p>
+        </w:tc>
+        <w:tc>
+          <w:tcPr>
+            <w:tcW w:type="dxa" w:w="2880"/>
+          </w:tcPr>
+          <w:p>
+            <w:r/>
+            <w:r>
+              <w:rPr>
+                <w:b w:val="0"/>
+              </w:rPr>
+              <w:t>24</w:t>
+            </w:r>
+          </w:p>
+        </w:tc>
+      </w:tr>
+      <w:tr>
+        <w:tc>
+          <w:tcPr>
+            <w:tcW w:type="dxa" w:w="2880"/>
+          </w:tcPr>
+          <w:p>
+            <w:r/>
+            <w:r>
+              <w:rPr>
+                <w:b w:val="0"/>
+              </w:rPr>
+              <w:t>Текст</w:t>
+            </w:r>
+          </w:p>
+        </w:tc>
+        <w:tc>
+          <w:tcPr>
+            <w:tcW w:type="dxa" w:w="2880"/>
+          </w:tcPr>
+          <w:p>
+            <w:r/>
+            <w:r>
+              <w:rPr>
+                <w:b w:val="0"/>
+              </w:rPr>
+              <w:t>Клинкерный фасад без «мокрых» работ. Монтаж зимой до −15 °C. Звоните!</w:t>
+            </w:r>
+          </w:p>
+        </w:tc>
+        <w:tc>
+          <w:tcPr>
+            <w:tcW w:type="dxa" w:w="2880"/>
+          </w:tcPr>
+          <w:p>
+            <w:r/>
+            <w:r>
+              <w:rPr>
+                <w:b w:val="0"/>
+              </w:rPr>
+              <w:t>71</w:t>
+            </w:r>
+          </w:p>
+        </w:tc>
+      </w:tr>
+      <w:tr>
+        <w:tc>
+          <w:tcPr>
+            <w:tcW w:type="dxa" w:w="2880"/>
+          </w:tcPr>
+          <w:p>
+            <w:r/>
+            <w:r>
+              <w:rPr>
+                <w:b w:val="0"/>
+              </w:rPr>
+              <w:t>Отображаемая ссылка</w:t>
+            </w:r>
+          </w:p>
+        </w:tc>
+        <w:tc>
+          <w:tcPr>
+            <w:tcW w:type="dxa" w:w="2880"/>
+          </w:tcPr>
+          <w:p>
+            <w:r/>
+            <w:r>
+              <w:rPr>
+                <w:b w:val="0"/>
+              </w:rPr>
+              <w:t>marmara-pro.ru/termo</w:t>
+            </w:r>
+          </w:p>
+        </w:tc>
+        <w:tc>
+          <w:tcPr>
+            <w:tcW w:type="dxa" w:w="2880"/>
+          </w:tcPr>
+          <w:p>
+            <w:r/>
+          </w:p>
+        </w:tc>
+      </w:tr>
+    </w:tbl>
+    <w:p/>
+    <w:p>
+      <w:pPr>
+        <w:pStyle w:val="Heading2"/>
+      </w:pPr>
+      <w:r>
+        <w:t>Объявление 3</w:t>
+      </w:r>
+    </w:p>
+    <w:tbl>
+      <w:tblPr>
+        <w:tblStyle w:val="TableGrid"/>
+        <w:tblW w:type="auto" w:w="0"/>
+        <w:tblLook w:firstColumn="1" w:firstRow="1" w:lastColumn="0" w:lastRow="0" w:noHBand="0" w:noVBand="1" w:val="04A0"/>
+      </w:tblPr>
+      <w:tblGrid>
+        <w:gridCol w:w="2880"/>
+        <w:gridCol w:w="2880"/>
+        <w:gridCol w:w="2880"/>
+      </w:tblGrid>
+      <w:tr>
+        <w:tc>
+          <w:tcPr>
+            <w:tcW w:type="dxa" w:w="2880"/>
+          </w:tcPr>
+          <w:p>
+            <w:r>
+              <w:rPr>
+                <w:b/>
+              </w:rPr>
+            </w:r>
+            <w:r>
+              <w:rPr>
+                <w:b/>
+              </w:rPr>
+              <w:t>Поле</w:t>
+            </w:r>
+          </w:p>
+        </w:tc>
+        <w:tc>
+          <w:tcPr>
+            <w:tcW w:type="dxa" w:w="2880"/>
+          </w:tcPr>
+          <w:p>
+            <w:r>
+              <w:rPr>
+                <w:b/>
+              </w:rPr>
+            </w:r>
+            <w:r>
+              <w:rPr>
+                <w:b/>
+              </w:rPr>
+              <w:t>Текст</w:t>
+            </w:r>
+          </w:p>
+        </w:tc>
+        <w:tc>
+          <w:tcPr>
+            <w:tcW w:type="dxa" w:w="2880"/>
+          </w:tcPr>
+          <w:p>
+            <w:r>
+              <w:rPr>
+                <w:b/>
+              </w:rPr>
+            </w:r>
+            <w:r>
+              <w:rPr>
+                <w:b/>
+              </w:rPr>
+              <w:t>Символов</w:t>
+            </w:r>
+          </w:p>
+        </w:tc>
+      </w:tr>
+      <w:tr>
+        <w:tc>
+          <w:tcPr>
+            <w:tcW w:type="dxa" w:w="2880"/>
+          </w:tcPr>
+          <w:p>
+            <w:r/>
+            <w:r>
+              <w:rPr>
+                <w:b w:val="0"/>
+              </w:rPr>
+              <w:t>Заголовок 1</w:t>
+            </w:r>
+          </w:p>
+        </w:tc>
+        <w:tc>
+          <w:tcPr>
+            <w:tcW w:type="dxa" w:w="2880"/>
+          </w:tcPr>
+          <w:p>
+            <w:r/>
+            <w:r>
+              <w:rPr>
+                <w:b w:val="0"/>
+              </w:rPr>
+              <w:t>Фасадные термопанели с клинкером</w:t>
+            </w:r>
+          </w:p>
+        </w:tc>
+        <w:tc>
+          <w:tcPr>
+            <w:tcW w:type="dxa" w:w="2880"/>
+          </w:tcPr>
+          <w:p>
+            <w:r/>
+            <w:r>
+              <w:rPr>
+                <w:b w:val="0"/>
+              </w:rPr>
+              <w:t>32</w:t>
+            </w:r>
+          </w:p>
+        </w:tc>
+      </w:tr>
+      <w:tr>
+        <w:tc>
+          <w:tcPr>
+            <w:tcW w:type="dxa" w:w="2880"/>
+          </w:tcPr>
+          <w:p>
+            <w:r/>
+            <w:r>
+              <w:rPr>
+                <w:b w:val="0"/>
+              </w:rPr>
+              <w:t>Заголовок 2</w:t>
+            </w:r>
+          </w:p>
+        </w:tc>
+        <w:tc>
+          <w:tcPr>
+            <w:tcW w:type="dxa" w:w="2880"/>
+          </w:tcPr>
+          <w:p>
+            <w:r/>
+            <w:r>
+              <w:rPr>
+                <w:b w:val="0"/>
+              </w:rPr>
+              <w:t>Доставка в Ленобласть</w:t>
+            </w:r>
+          </w:p>
+        </w:tc>
+        <w:tc>
+          <w:tcPr>
+            <w:tcW w:type="dxa" w:w="2880"/>
+          </w:tcPr>
+          <w:p>
+            <w:r/>
+            <w:r>
+              <w:rPr>
+                <w:b w:val="0"/>
+              </w:rPr>
+              <w:t>21</w:t>
+            </w:r>
+          </w:p>
+        </w:tc>
+      </w:tr>
+      <w:tr>
+        <w:tc>
+          <w:tcPr>
+            <w:tcW w:type="dxa" w:w="2880"/>
+          </w:tcPr>
+          <w:p>
+            <w:r/>
+            <w:r>
+              <w:rPr>
+                <w:b w:val="0"/>
+              </w:rPr>
+              <w:t>Текст</w:t>
+            </w:r>
+          </w:p>
+        </w:tc>
+        <w:tc>
+          <w:tcPr>
+            <w:tcW w:type="dxa" w:w="2880"/>
+          </w:tcPr>
+          <w:p>
+            <w:r/>
+            <w:r>
+              <w:rPr>
+                <w:b w:val="0"/>
+              </w:rPr>
+              <w:t>Завод в Выборге. Срок службы 25–50 лет. Не требуют покраски. Консультация.</w:t>
+            </w:r>
+          </w:p>
+        </w:tc>
+        <w:tc>
+          <w:tcPr>
+            <w:tcW w:type="dxa" w:w="2880"/>
+          </w:tcPr>
+          <w:p>
+            <w:r/>
+            <w:r>
+              <w:rPr>
+                <w:b w:val="0"/>
+              </w:rPr>
+              <w:t>75</w:t>
+            </w:r>
+          </w:p>
+        </w:tc>
+      </w:tr>
+      <w:tr>
+        <w:tc>
+          <w:tcPr>
+            <w:tcW w:type="dxa" w:w="2880"/>
+          </w:tcPr>
+          <w:p>
+            <w:r/>
+            <w:r>
+              <w:rPr>
+                <w:b w:val="0"/>
+              </w:rPr>
+              <w:t>Отображаемая ссылка</w:t>
+            </w:r>
+          </w:p>
+        </w:tc>
+        <w:tc>
+          <w:tcPr>
+            <w:tcW w:type="dxa" w:w="2880"/>
+          </w:tcPr>
+          <w:p>
+            <w:r/>
+            <w:r>
+              <w:rPr>
+                <w:b w:val="0"/>
+              </w:rPr>
+              <w:t>marmara-pro.ru/termo</w:t>
+            </w:r>
+          </w:p>
+        </w:tc>
+        <w:tc>
+          <w:tcPr>
+            <w:tcW w:type="dxa" w:w="2880"/>
+          </w:tcPr>
+          <w:p>
+            <w:r/>
+          </w:p>
+        </w:tc>
+      </w:tr>
+    </w:tbl>
+    <w:p/>
+    <w:p>
+      <w:pPr>
+        <w:pStyle w:val="Heading2"/>
+      </w:pPr>
+      <w:r>
+        <w:t>Объявление 4</w:t>
+      </w:r>
+    </w:p>
+    <w:tbl>
+      <w:tblPr>
+        <w:tblStyle w:val="TableGrid"/>
+        <w:tblW w:type="auto" w:w="0"/>
+        <w:tblLook w:firstColumn="1" w:firstRow="1" w:lastColumn="0" w:lastRow="0" w:noHBand="0" w:noVBand="1" w:val="04A0"/>
+      </w:tblPr>
+      <w:tblGrid>
+        <w:gridCol w:w="2880"/>
+        <w:gridCol w:w="2880"/>
+        <w:gridCol w:w="2880"/>
+      </w:tblGrid>
+      <w:tr>
+        <w:tc>
+          <w:tcPr>
+            <w:tcW w:type="dxa" w:w="2880"/>
+          </w:tcPr>
+          <w:p>
+            <w:r>
+              <w:rPr>
+                <w:b/>
+              </w:rPr>
+            </w:r>
+            <w:r>
+              <w:rPr>
+                <w:b/>
+              </w:rPr>
+              <w:t>Поле</w:t>
+            </w:r>
+          </w:p>
+        </w:tc>
+        <w:tc>
+          <w:tcPr>
+            <w:tcW w:type="dxa" w:w="2880"/>
+          </w:tcPr>
+          <w:p>
+            <w:r>
+              <w:rPr>
+                <w:b/>
+              </w:rPr>
+            </w:r>
+            <w:r>
+              <w:rPr>
+                <w:b/>
+              </w:rPr>
+              <w:t>Текст</w:t>
+            </w:r>
+          </w:p>
+        </w:tc>
+        <w:tc>
+          <w:tcPr>
+            <w:tcW w:type="dxa" w:w="2880"/>
+          </w:tcPr>
+          <w:p>
+            <w:r>
+              <w:rPr>
+                <w:b/>
+              </w:rPr>
+            </w:r>
+            <w:r>
+              <w:rPr>
+                <w:b/>
+              </w:rPr>
+              <w:t>Символов</w:t>
+            </w:r>
+          </w:p>
+        </w:tc>
+      </w:tr>
+      <w:tr>
+        <w:tc>
+          <w:tcPr>
+            <w:tcW w:type="dxa" w:w="2880"/>
+          </w:tcPr>
+          <w:p>
+            <w:r/>
+            <w:r>
+              <w:rPr>
+                <w:b w:val="0"/>
+              </w:rPr>
+              <w:t>Заголовок 1</w:t>
+            </w:r>
+          </w:p>
+        </w:tc>
+        <w:tc>
+          <w:tcPr>
+            <w:tcW w:type="dxa" w:w="2880"/>
+          </w:tcPr>
+          <w:p>
+            <w:r/>
+            <w:r>
+              <w:rPr>
+                <w:b w:val="0"/>
+              </w:rPr>
+              <w:t>Клинкерные термопанели — КлинкерПрофи</w:t>
+            </w:r>
+          </w:p>
+        </w:tc>
+        <w:tc>
+          <w:tcPr>
+            <w:tcW w:type="dxa" w:w="2880"/>
+          </w:tcPr>
+          <w:p>
+            <w:r/>
+            <w:r>
+              <w:rPr>
+                <w:b w:val="0"/>
+              </w:rPr>
+              <w:t>34</w:t>
+            </w:r>
+          </w:p>
+        </w:tc>
+      </w:tr>
+      <w:tr>
+        <w:tc>
+          <w:tcPr>
+            <w:tcW w:type="dxa" w:w="2880"/>
+          </w:tcPr>
+          <w:p>
+            <w:r/>
+            <w:r>
+              <w:rPr>
+                <w:b w:val="0"/>
+              </w:rPr>
+              <w:t>Заголовок 2</w:t>
+            </w:r>
+          </w:p>
+        </w:tc>
+        <w:tc>
+          <w:tcPr>
+            <w:tcW w:type="dxa" w:w="2880"/>
+          </w:tcPr>
+          <w:p>
+            <w:r/>
+            <w:r>
+              <w:rPr>
+                <w:b w:val="0"/>
+              </w:rPr>
+              <w:t>Приозерск и район</w:t>
+            </w:r>
+          </w:p>
+        </w:tc>
+        <w:tc>
+          <w:tcPr>
+            <w:tcW w:type="dxa" w:w="2880"/>
+          </w:tcPr>
+          <w:p>
+            <w:r/>
+            <w:r>
+              <w:rPr>
+                <w:b w:val="0"/>
+              </w:rPr>
+              <w:t>17</w:t>
+            </w:r>
+          </w:p>
+        </w:tc>
+      </w:tr>
+      <w:tr>
+        <w:tc>
+          <w:tcPr>
+            <w:tcW w:type="dxa" w:w="2880"/>
+          </w:tcPr>
+          <w:p>
+            <w:r/>
+            <w:r>
+              <w:rPr>
+                <w:b w:val="0"/>
+              </w:rPr>
+              <w:t>Текст</w:t>
+            </w:r>
+          </w:p>
+        </w:tc>
+        <w:tc>
+          <w:tcPr>
+            <w:tcW w:type="dxa" w:w="2880"/>
+          </w:tcPr>
+          <w:p>
+            <w:r/>
+            <w:r>
+              <w:rPr>
+                <w:b w:val="0"/>
+              </w:rPr>
+              <w:t>Сухой монтаж за дни, не недели. ППС и ППУ на выбор. Подберём толщину под дом.</w:t>
+            </w:r>
+          </w:p>
+        </w:tc>
+        <w:tc>
+          <w:tcPr>
+            <w:tcW w:type="dxa" w:w="2880"/>
+          </w:tcPr>
+          <w:p>
+            <w:r/>
+            <w:r>
+              <w:rPr>
+                <w:b w:val="0"/>
+              </w:rPr>
+              <w:t>78</w:t>
+            </w:r>
+          </w:p>
+        </w:tc>
+      </w:tr>
+      <w:tr>
+        <w:tc>
+          <w:tcPr>
+            <w:tcW w:type="dxa" w:w="2880"/>
+          </w:tcPr>
+          <w:p>
+            <w:r/>
+            <w:r>
+              <w:rPr>
+                <w:b w:val="0"/>
+              </w:rPr>
+              <w:t>Отображаемая ссылка</w:t>
+            </w:r>
+          </w:p>
+        </w:tc>
+        <w:tc>
+          <w:tcPr>
+            <w:tcW w:type="dxa" w:w="2880"/>
+          </w:tcPr>
+          <w:p>
+            <w:r/>
+            <w:r>
+              <w:rPr>
+                <w:b w:val="0"/>
+              </w:rPr>
+              <w:t>marmara-pro.ru/termo</w:t>
+            </w:r>
+          </w:p>
+        </w:tc>
+        <w:tc>
+          <w:tcPr>
+            <w:tcW w:type="dxa" w:w="2880"/>
+          </w:tcPr>
+          <w:p>
+            <w:r/>
+          </w:p>
+        </w:tc>
+      </w:tr>
+    </w:tbl>
+    <w:p/>
+    <w:p>
+      <w:pPr>
+        <w:pStyle w:val="Heading2"/>
+      </w:pPr>
+      <w:r>
+        <w:t>Объявление 5</w:t>
+      </w:r>
+    </w:p>
+    <w:tbl>
+      <w:tblPr>
+        <w:tblStyle w:val="TableGrid"/>
+        <w:tblW w:type="auto" w:w="0"/>
+        <w:tblLook w:firstColumn="1" w:firstRow="1" w:lastColumn="0" w:lastRow="0" w:noHBand="0" w:noVBand="1" w:val="04A0"/>
+      </w:tblPr>
+      <w:tblGrid>
+        <w:gridCol w:w="2880"/>
+        <w:gridCol w:w="2880"/>
+        <w:gridCol w:w="2880"/>
+      </w:tblGrid>
+      <w:tr>
+        <w:tc>
+          <w:tcPr>
+            <w:tcW w:type="dxa" w:w="2880"/>
+          </w:tcPr>
+          <w:p>
+            <w:r>
+              <w:rPr>
+                <w:b/>
+              </w:rPr>
+            </w:r>
+            <w:r>
+              <w:rPr>
+                <w:b/>
+              </w:rPr>
+              <w:t>Поле</w:t>
+            </w:r>
+          </w:p>
+        </w:tc>
+        <w:tc>
+          <w:tcPr>
+            <w:tcW w:type="dxa" w:w="2880"/>
+          </w:tcPr>
+          <w:p>
+            <w:r>
+              <w:rPr>
+                <w:b/>
+              </w:rPr>
+            </w:r>
+            <w:r>
+              <w:rPr>
+                <w:b/>
+              </w:rPr>
+              <w:t>Текст</w:t>
+            </w:r>
+          </w:p>
+        </w:tc>
+        <w:tc>
+          <w:tcPr>
+            <w:tcW w:type="dxa" w:w="2880"/>
+          </w:tcPr>
+          <w:p>
+            <w:r>
+              <w:rPr>
+                <w:b/>
+              </w:rPr>
+            </w:r>
+            <w:r>
+              <w:rPr>
+                <w:b/>
+              </w:rPr>
+              <w:t>Символов</w:t>
+            </w:r>
+          </w:p>
+        </w:tc>
+      </w:tr>
+      <w:tr>
+        <w:tc>
+          <w:tcPr>
+            <w:tcW w:type="dxa" w:w="2880"/>
+          </w:tcPr>
+          <w:p>
+            <w:r/>
+            <w:r>
+              <w:rPr>
+                <w:b w:val="0"/>
+              </w:rPr>
+              <w:t>Заголовок 1</w:t>
+            </w:r>
+          </w:p>
+        </w:tc>
+        <w:tc>
+          <w:tcPr>
+            <w:tcW w:type="dxa" w:w="2880"/>
+          </w:tcPr>
+          <w:p>
+            <w:r/>
+            <w:r>
+              <w:rPr>
+                <w:b w:val="0"/>
+              </w:rPr>
+              <w:t>Утепление фасада термопанелями</w:t>
+            </w:r>
+          </w:p>
+        </w:tc>
+        <w:tc>
+          <w:tcPr>
+            <w:tcW w:type="dxa" w:w="2880"/>
+          </w:tcPr>
+          <w:p>
+            <w:r/>
+            <w:r>
+              <w:rPr>
+                <w:b w:val="0"/>
+              </w:rPr>
+              <w:t>30</w:t>
+            </w:r>
+          </w:p>
+        </w:tc>
+      </w:tr>
+      <w:tr>
+        <w:tc>
+          <w:tcPr>
+            <w:tcW w:type="dxa" w:w="2880"/>
+          </w:tcPr>
+          <w:p>
+            <w:r/>
+            <w:r>
+              <w:rPr>
+                <w:b w:val="0"/>
+              </w:rPr>
+              <w:t>Заголовок 2</w:t>
+            </w:r>
+          </w:p>
+        </w:tc>
+        <w:tc>
+          <w:tcPr>
+            <w:tcW w:type="dxa" w:w="2880"/>
+          </w:tcPr>
+          <w:p>
+            <w:r/>
+            <w:r>
+              <w:rPr>
+                <w:b w:val="0"/>
+              </w:rPr>
+              <w:t>КлинкерПрофи, Выборг</w:t>
+            </w:r>
+          </w:p>
+        </w:tc>
+        <w:tc>
+          <w:tcPr>
+            <w:tcW w:type="dxa" w:w="2880"/>
+          </w:tcPr>
+          <w:p>
+            <w:r/>
+            <w:r>
+              <w:rPr>
+                <w:b w:val="0"/>
+              </w:rPr>
+              <w:t>19</w:t>
+            </w:r>
+          </w:p>
+        </w:tc>
+      </w:tr>
+      <w:tr>
+        <w:tc>
+          <w:tcPr>
+            <w:tcW w:type="dxa" w:w="2880"/>
+          </w:tcPr>
+          <w:p>
+            <w:r/>
+            <w:r>
+              <w:rPr>
+                <w:b w:val="0"/>
+              </w:rPr>
+              <w:t>Текст</w:t>
+            </w:r>
+          </w:p>
+        </w:tc>
+        <w:tc>
+          <w:tcPr>
+            <w:tcW w:type="dxa" w:w="2880"/>
+          </w:tcPr>
+          <w:p>
+            <w:r/>
+            <w:r>
+              <w:rPr>
+                <w:b w:val="0"/>
+              </w:rPr>
+              <w:t>Вид кирпичной кладки без кладки. Срок поставки от 7 дней. Доставка по области.</w:t>
+            </w:r>
+          </w:p>
+        </w:tc>
+        <w:tc>
+          <w:tcPr>
+            <w:tcW w:type="dxa" w:w="2880"/>
+          </w:tcPr>
+          <w:p>
+            <w:r/>
+            <w:r>
+              <w:rPr>
+                <w:b w:val="0"/>
+              </w:rPr>
+              <w:t>77</w:t>
+            </w:r>
+          </w:p>
+        </w:tc>
+      </w:tr>
+      <w:tr>
+        <w:tc>
+          <w:tcPr>
+            <w:tcW w:type="dxa" w:w="2880"/>
+          </w:tcPr>
+          <w:p>
+            <w:r/>
+            <w:r>
+              <w:rPr>
+                <w:b w:val="0"/>
+              </w:rPr>
+              <w:t>Отображаемая ссылка</w:t>
+            </w:r>
+          </w:p>
+        </w:tc>
+        <w:tc>
+          <w:tcPr>
+            <w:tcW w:type="dxa" w:w="2880"/>
+          </w:tcPr>
+          <w:p>
+            <w:r/>
+            <w:r>
+              <w:rPr>
+                <w:b w:val="0"/>
+              </w:rPr>
+              <w:t>marmara-pro.ru/termo</w:t>
+            </w:r>
+          </w:p>
+        </w:tc>
+        <w:tc>
+          <w:tcPr>
+            <w:tcW w:type="dxa" w:w="2880"/>
+          </w:tcPr>
+          <w:p>
+            <w:r/>
+          </w:p>
+        </w:tc>
+      </w:tr>
+    </w:tbl>
+    <w:p/>
+    <w:p>
+      <w:pPr>
+        <w:pStyle w:val="Heading2"/>
+      </w:pPr>
+      <w:r>
+        <w:t>Быстрые ссылки (расширения, на уровне кампании)</w:t>
+      </w:r>
+    </w:p>
+    <w:tbl>
+      <w:tblPr>
+        <w:tblStyle w:val="TableGrid"/>
+        <w:tblW w:type="auto" w:w="0"/>
+        <w:tblLook w:firstColumn="1" w:firstRow="1" w:lastColumn="0" w:lastRow="0" w:noHBand="0" w:noVBand="1" w:val="04A0"/>
+      </w:tblPr>
+      <w:tblGrid>
+        <w:gridCol w:w="4320"/>
+        <w:gridCol w:w="4320"/>
+      </w:tblGrid>
+      <w:tr>
+        <w:tc>
+          <w:tcPr>
+            <w:tcW w:type="dxa" w:w="4320"/>
+          </w:tcPr>
+          <w:p>
+            <w:r>
+              <w:rPr>
+                <w:b/>
+              </w:rPr>
+            </w:r>
+            <w:r>
+              <w:rPr>
+                <w:b/>
+              </w:rPr>
+              <w:t>Заголовок</w:t>
+            </w:r>
+          </w:p>
+        </w:tc>
+        <w:tc>
+          <w:tcPr>
+            <w:tcW w:type="dxa" w:w="4320"/>
+          </w:tcPr>
+          <w:p>
+            <w:r>
+              <w:rPr>
+                <w:b/>
+              </w:rPr>
+            </w:r>
+            <w:r>
+              <w:rPr>
+                <w:b/>
+              </w:rPr>
+              <w:t>URL</w:t>
+            </w:r>
+          </w:p>
+        </w:tc>
+      </w:tr>
+      <w:tr>
+        <w:tc>
+          <w:tcPr>
+            <w:tcW w:type="dxa" w:w="4320"/>
+          </w:tcPr>
+          <w:p>
+            <w:r/>
+            <w:r>
+              <w:rPr>
+                <w:b w:val="0"/>
+              </w:rPr>
+              <w:t>Каталог термопанелей</w:t>
+            </w:r>
+          </w:p>
+        </w:tc>
+        <w:tc>
+          <w:tcPr>
+            <w:tcW w:type="dxa" w:w="4320"/>
+          </w:tcPr>
+          <w:p>
+            <w:r/>
+            <w:r>
+              <w:rPr>
+                <w:b w:val="0"/>
+              </w:rPr>
+              <w:t>https://marmara-pro.ru/termo</w:t>
+            </w:r>
+          </w:p>
+        </w:tc>
+      </w:tr>
+      <w:tr>
+        <w:tc>
+          <w:tcPr>
+            <w:tcW w:type="dxa" w:w="4320"/>
+          </w:tcPr>
+          <w:p>
+            <w:r/>
+            <w:r>
+              <w:rPr>
+                <w:b w:val="0"/>
+              </w:rPr>
+              <w:t>Как монтируют</w:t>
+            </w:r>
+          </w:p>
+        </w:tc>
+        <w:tc>
+          <w:tcPr>
+            <w:tcW w:type="dxa" w:w="4320"/>
+          </w:tcPr>
+          <w:p>
+            <w:r/>
+            <w:r>
+              <w:rPr>
+                <w:b w:val="0"/>
+              </w:rPr>
+              <w:t>https://marmara-pro.ru/termo#montazh (или якорь на странице)</w:t>
+            </w:r>
+          </w:p>
+        </w:tc>
+      </w:tr>
+      <w:tr>
+        <w:tc>
+          <w:tcPr>
+            <w:tcW w:type="dxa" w:w="4320"/>
+          </w:tcPr>
+          <w:p>
+            <w:r/>
+            <w:r>
+              <w:rPr>
+                <w:b w:val="0"/>
+              </w:rPr>
+              <w:t>Контакты</w:t>
+            </w:r>
+          </w:p>
+        </w:tc>
+        <w:tc>
+          <w:tcPr>
+            <w:tcW w:type="dxa" w:w="4320"/>
+          </w:tcPr>
+          <w:p>
+            <w:r/>
+            <w:r>
+              <w:rPr>
+                <w:b w:val="0"/>
+              </w:rPr>
+              <w:t>https://marmara-pro.ru/main#contacts</w:t>
+            </w:r>
+          </w:p>
+        </w:tc>
+      </w:tr>
+      <w:tr>
+        <w:tc>
+          <w:tcPr>
+            <w:tcW w:type="dxa" w:w="4320"/>
+          </w:tcPr>
+          <w:p>
+            <w:r/>
+            <w:r>
+              <w:rPr>
+                <w:b w:val="0"/>
+              </w:rPr>
+              <w:t>Позвонить</w:t>
+            </w:r>
+          </w:p>
+        </w:tc>
+        <w:tc>
+          <w:tcPr>
+            <w:tcW w:type="dxa" w:w="4320"/>
+          </w:tcPr>
+          <w:p>
+            <w:r/>
+            <w:r>
+              <w:rPr>
+                <w:b w:val="0"/>
+              </w:rPr>
+              <w:t>tel:+79217457755</w:t>
+            </w:r>
+          </w:p>
+        </w:tc>
+      </w:tr>
+    </w:tbl>
+    <w:p/>
+    <w:p>
+      <w:pPr>
+        <w:pStyle w:val="Heading2"/>
+      </w:pPr>
+      <w:r>
+        <w:t>Уточнения</w:t>
       </w:r>
     </w:p>
     <w:p>
+      <w:pPr>
+        <w:pStyle w:val="ListBullet"/>
+      </w:pPr>
       <w:r>
-        <w:t>**Основной регион показа:** Приозерский район, Ленинградская область.</w:t>
+        <w:rPr>
+          <w:b w:val="0"/>
+        </w:rPr>
+        <w:t>Собственное производство в Выборге</w:t>
       </w:r>
     </w:p>
     <w:p>
+      <w:pPr>
+        <w:pStyle w:val="ListBullet"/>
+      </w:pPr>
       <w:r>
-        <w:t>**Населённые пункты для повышения ставок (+20…+40 %):**</w:t>
+        <w:rPr>
+          <w:b w:val="0"/>
+        </w:rPr>
+        <w:t>Доставка по Ленинградской области</w:t>
       </w:r>
     </w:p>
     <w:p>
+      <w:pPr>
+        <w:pStyle w:val="ListBullet"/>
+      </w:pPr>
       <w:r>
-        <w:t>| Населённый пункт | Примечание |</w:t>
+        <w:rPr>
+          <w:b w:val="0"/>
+        </w:rPr>
+        <w:t>Срок службы 25–50 лет</w:t>
       </w:r>
     </w:p>
     <w:p>
+      <w:pPr>
+        <w:pStyle w:val="ListBullet"/>
+      </w:pPr>
       <w:r>
-        <w:t>|---|---|</w:t>
+        <w:rPr>
+          <w:b w:val="0"/>
+        </w:rPr>
+        <w:t>Монтаж зимой до −15 °C</w:t>
       </w:r>
     </w:p>
     <w:p>
+      <w:pPr>
+        <w:pStyle w:val="ListBullet"/>
+      </w:pPr>
       <w:r>
-        <w:t>| Приозерск | Административный центр района |</w:t>
+        <w:rPr>
+          <w:b w:val="0"/>
+        </w:rPr>
+        <w:t>Пенополистирол и пенополиуретан</w:t>
       </w:r>
     </w:p>
     <w:p>
+      <w:pPr>
+        <w:pStyle w:val="ListBullet"/>
+      </w:pPr>
       <w:r>
-        <w:t>| Сосново | Крупный посёлок, дачное строительство |</w:t>
-      </w:r>
-    </w:p>
-    <w:p>
-      <w:r>
-        <w:t>| Кузнечное | |</w:t>
-      </w:r>
-    </w:p>
-    <w:p>
-      <w:r>
-        <w:t>| Мельниково | |</w:t>
-      </w:r>
-    </w:p>
-    <w:p>
-      <w:r>
-        <w:t>| Лесогорский | |</w:t>
-      </w:r>
-    </w:p>
-    <w:p>
-      <w:r>
-        <w:t>| Ромашки | Курортная зона, частное строительство |</w:t>
-      </w:r>
-    </w:p>
-    <w:p>
-      <w:r>
-        <w:t>| Синявино | |</w:t>
-      </w:r>
-    </w:p>
-    <w:p>
-      <w:r>
-        <w:t>**Корректировка ставок для мобильных:** +10…+15 % (звонки с телефона — основной канал).</w:t>
-      </w:r>
-    </w:p>
-    <w:p>
-      <w:r>
-        <w:t>Завод и склад — **г. Выборг** (~80 км от Приозерска). В объявлениях акцент на «собственное производство в Ленобласти» и «доставка по области», без обещания бесплатной доставки в Приозерский район (в FAQ бесплатная доставка указана для Выборгского района).</w:t>
+        <w:rPr>
+          <w:b w:val="0"/>
+        </w:rPr>
+        <w:t>Консультация и подбор толщины</w:t>
       </w:r>
     </w:p>
     <w:p>
@@ -174,196 +3263,185 @@
         <w:pStyle w:val="Heading2"/>
       </w:pPr>
       <w:r>
-        <w:t>Ключевые фразы</w:t>
+        <w:t>Визитка (если подключена)</w:t>
       </w:r>
     </w:p>
-    <w:p>
-      <w:r>
-        <w:t>Файл для импорта: [`termopaneli-priozersky-keywords.csv`](termopaneli-priozersky-keywords.csv)</w:t>
-      </w:r>
-    </w:p>
+    <w:tbl>
+      <w:tblPr>
+        <w:tblStyle w:val="TableGrid"/>
+        <w:tblW w:type="auto" w:w="0"/>
+        <w:tblLook w:firstColumn="1" w:firstRow="1" w:lastColumn="0" w:lastRow="0" w:noHBand="0" w:noVBand="1" w:val="04A0"/>
+      </w:tblPr>
+      <w:tblGrid>
+        <w:gridCol w:w="4320"/>
+        <w:gridCol w:w="4320"/>
+      </w:tblGrid>
+      <w:tr>
+        <w:tc>
+          <w:tcPr>
+            <w:tcW w:type="dxa" w:w="4320"/>
+          </w:tcPr>
+          <w:p>
+            <w:r>
+              <w:rPr>
+                <w:b/>
+              </w:rPr>
+            </w:r>
+            <w:r>
+              <w:rPr>
+                <w:b/>
+              </w:rPr>
+              <w:t>Поле</w:t>
+            </w:r>
+          </w:p>
+        </w:tc>
+        <w:tc>
+          <w:tcPr>
+            <w:tcW w:type="dxa" w:w="4320"/>
+          </w:tcPr>
+          <w:p>
+            <w:r>
+              <w:rPr>
+                <w:b/>
+              </w:rPr>
+            </w:r>
+            <w:r>
+              <w:rPr>
+                <w:b/>
+              </w:rPr>
+              <w:t>Значение</w:t>
+            </w:r>
+          </w:p>
+        </w:tc>
+      </w:tr>
+      <w:tr>
+        <w:tc>
+          <w:tcPr>
+            <w:tcW w:type="dxa" w:w="4320"/>
+          </w:tcPr>
+          <w:p>
+            <w:r/>
+            <w:r>
+              <w:rPr>
+                <w:b w:val="0"/>
+              </w:rPr>
+              <w:t>Организация</w:t>
+            </w:r>
+          </w:p>
+        </w:tc>
+        <w:tc>
+          <w:tcPr>
+            <w:tcW w:type="dxa" w:w="4320"/>
+          </w:tcPr>
+          <w:p>
+            <w:r/>
+            <w:r>
+              <w:rPr>
+                <w:b w:val="0"/>
+              </w:rPr>
+              <w:t>КлинкерПрофи</w:t>
+            </w:r>
+          </w:p>
+        </w:tc>
+      </w:tr>
+      <w:tr>
+        <w:tc>
+          <w:tcPr>
+            <w:tcW w:type="dxa" w:w="4320"/>
+          </w:tcPr>
+          <w:p>
+            <w:r/>
+            <w:r>
+              <w:rPr>
+                <w:b w:val="0"/>
+              </w:rPr>
+              <w:t>Телефон</w:t>
+            </w:r>
+          </w:p>
+        </w:tc>
+        <w:tc>
+          <w:tcPr>
+            <w:tcW w:type="dxa" w:w="4320"/>
+          </w:tcPr>
+          <w:p>
+            <w:r/>
+            <w:r>
+              <w:rPr>
+                <w:b w:val="0"/>
+              </w:rPr>
+              <w:t>+7 (921) 745-77-55</w:t>
+            </w:r>
+          </w:p>
+        </w:tc>
+      </w:tr>
+      <w:tr>
+        <w:tc>
+          <w:tcPr>
+            <w:tcW w:type="dxa" w:w="4320"/>
+          </w:tcPr>
+          <w:p>
+            <w:r/>
+            <w:r>
+              <w:rPr>
+                <w:b w:val="0"/>
+              </w:rPr>
+              <w:t>Адрес</w:t>
+            </w:r>
+          </w:p>
+        </w:tc>
+        <w:tc>
+          <w:tcPr>
+            <w:tcW w:type="dxa" w:w="4320"/>
+          </w:tcPr>
+          <w:p>
+            <w:r/>
+            <w:r>
+              <w:rPr>
+                <w:b w:val="0"/>
+              </w:rPr>
+              <w:t>г. Выборг, ул. Ленина, 11</w:t>
+            </w:r>
+          </w:p>
+        </w:tc>
+      </w:tr>
+      <w:tr>
+        <w:tc>
+          <w:tcPr>
+            <w:tcW w:type="dxa" w:w="4320"/>
+          </w:tcPr>
+          <w:p>
+            <w:r/>
+            <w:r>
+              <w:rPr>
+                <w:b w:val="0"/>
+              </w:rPr>
+              <w:t>Режим работы</w:t>
+            </w:r>
+          </w:p>
+        </w:tc>
+        <w:tc>
+          <w:tcPr>
+            <w:tcW w:type="dxa" w:w="4320"/>
+          </w:tcPr>
+          <w:p>
+            <w:r/>
+            <w:r>
+              <w:rPr>
+                <w:b w:val="0"/>
+              </w:rPr>
+              <w:t>ежедневно 9:00–20:00</w:t>
+            </w:r>
+          </w:p>
+        </w:tc>
+      </w:tr>
+    </w:tbl>
+    <w:p/>
     <w:p>
       <w:pPr>
-        <w:pStyle w:val="Heading3"/>
+        <w:pStyle w:val="Heading1"/>
       </w:pPr>
       <w:r>
-        <w:t>Группа «Коммерческие — гео»</w:t>
-      </w:r>
-    </w:p>
-    <w:p>
-      <w:r>
-        <w:t>| Ключевая фраза | Тип |</w:t>
-      </w:r>
-    </w:p>
-    <w:p>
-      <w:r>
-        <w:t>|---|---|</w:t>
-      </w:r>
-    </w:p>
-    <w:p>
-      <w:r>
-        <w:t>| термопанели приозерск | фразовое |</w:t>
-      </w:r>
-    </w:p>
-    <w:p>
-      <w:r>
-        <w:t>| термопанели приозерский район | фразовое |</w:t>
-      </w:r>
-    </w:p>
-    <w:p>
-      <w:r>
-        <w:t>| купить термопанели приозерск | фразовое |</w:t>
-      </w:r>
-    </w:p>
-    <w:p>
-      <w:r>
-        <w:t>| термопанели сосново | фразовое |</w:t>
-      </w:r>
-    </w:p>
-    <w:p>
-      <w:r>
-        <w:t>| термопанели кузнечное | фразовое |</w:t>
-      </w:r>
-    </w:p>
-    <w:p>
-      <w:r>
-        <w:t>| фасадные термопанели приозерск | фразовое |</w:t>
-      </w:r>
-    </w:p>
-    <w:p>
-      <w:r>
-        <w:t>| термопанели для дома приозерск | фразовое |</w:t>
-      </w:r>
-    </w:p>
-    <w:p>
-      <w:r>
-        <w:t>| термопанели с клинкером приозерск | фразовое |</w:t>
-      </w:r>
-    </w:p>
-    <w:p>
-      <w:r>
-        <w:t>| клинкерные термопанели приозерский район | фразовое |</w:t>
-      </w:r>
-    </w:p>
-    <w:p>
-      <w:r>
-        <w:t>| термопанели ленинградская область купить | фразовое |</w:t>
-      </w:r>
-    </w:p>
-    <w:p>
-      <w:pPr>
-        <w:pStyle w:val="Heading3"/>
-      </w:pPr>
-      <w:r>
-        <w:t>Группа «Коммерческие — общие»</w:t>
-      </w:r>
-    </w:p>
-    <w:p>
-      <w:r>
-        <w:t>| Ключевая фраза | Тип |</w:t>
-      </w:r>
-    </w:p>
-    <w:p>
-      <w:r>
-        <w:t>|---|---|</w:t>
-      </w:r>
-    </w:p>
-    <w:p>
-      <w:r>
-        <w:t>| термопанели с клинкерной плиткой | фразовое |</w:t>
-      </w:r>
-    </w:p>
-    <w:p>
-      <w:r>
-        <w:t>| фасадные термопанели с клинкером | фразовое |</w:t>
-      </w:r>
-    </w:p>
-    <w:p>
-      <w:r>
-        <w:t>| клинкерные термопанели купить | фразовое |</w:t>
-      </w:r>
-    </w:p>
-    <w:p>
-      <w:r>
-        <w:t>| термопанели с клинкером | фразовое |</w:t>
-      </w:r>
-    </w:p>
-    <w:p>
-      <w:r>
-        <w:t>| термопанели для фасада дома | фразовое |</w:t>
-      </w:r>
-    </w:p>
-    <w:p>
-      <w:r>
-        <w:t>| утепление фасада термопанелями | фразовое |</w:t>
-      </w:r>
-    </w:p>
-    <w:p>
-      <w:r>
-        <w:t>| термопанели пенополиуретан | фразовое |</w:t>
-      </w:r>
-    </w:p>
-    <w:p>
-      <w:r>
-        <w:t>| термопанели пенополистирол | фразовое |</w:t>
-      </w:r>
-    </w:p>
-    <w:p>
-      <w:r>
-        <w:t>| термопанели производитель | фразовое |</w:t>
-      </w:r>
-    </w:p>
-    <w:p>
-      <w:r>
-        <w:t>| термопанели выборг | фразовое |</w:t>
-      </w:r>
-    </w:p>
-    <w:p>
-      <w:r>
-        <w:t>| облицовка фасада термопанелями | фразовое |</w:t>
-      </w:r>
-    </w:p>
-    <w:p>
-      <w:r>
-        <w:t>| фасадные панели с утеплителем | фразовое |</w:t>
-      </w:r>
-    </w:p>
-    <w:p>
-      <w:r>
-        <w:t>| термопанели под кирпич | фразовое |</w:t>
-      </w:r>
-    </w:p>
-    <w:p>
-      <w:r>
-        <w:t>| термопанели клинкерный кирпич | фразовое |</w:t>
-      </w:r>
-    </w:p>
-    <w:p>
-      <w:pPr>
-        <w:pStyle w:val="Heading3"/>
-      </w:pPr>
-      <w:r>
-        <w:t>Широкие (осторожно, с минус-словами)</w:t>
-      </w:r>
-    </w:p>
-    <w:p>
-      <w:r>
-        <w:t>| Ключевая фраза | Тип |</w:t>
-      </w:r>
-    </w:p>
-    <w:p>
-      <w:r>
-        <w:t>|---|---|</w:t>
-      </w:r>
-    </w:p>
-    <w:p>
-      <w:r>
-        <w:t>| термопанели | широкое |</w:t>
-      </w:r>
-    </w:p>
-    <w:p>
-      <w:r>
-        <w:t>| фасадные термопанели | широкое |</w:t>
+        <w:t>6. Инструкция: добавить группу в Яндекс Директ</w:t>
       </w:r>
     </w:p>
     <w:p>
@@ -371,27 +3449,178 @@
         <w:pStyle w:val="Heading2"/>
       </w:pPr>
       <w:r>
-        <w:t>Минус-слова</w:t>
+        <w:t>Вариант А — группа в существующей кампании «Термопанели»</w:t>
       </w:r>
     </w:p>
     <w:p>
+      <w:pPr>
+        <w:pStyle w:val="ListNumber"/>
+      </w:pPr>
       <w:r>
-        <w:t>**На уровне кампании (общие):**</w:t>
+        <w:rPr>
+          <w:b w:val="0"/>
+        </w:rPr>
+        <w:t xml:space="preserve">Войти в [Яндекс Директ](https://direct.yandex.ru/) → кампания </w:t>
+      </w:r>
+      <w:r>
+        <w:rPr>
+          <w:b/>
+        </w:rPr>
+        <w:t>Термопанели</w:t>
+      </w:r>
+      <w:r>
+        <w:rPr>
+          <w:b w:val="0"/>
+        </w:rPr>
+        <w:t>.</w:t>
       </w:r>
     </w:p>
     <w:p>
+      <w:pPr>
+        <w:pStyle w:val="ListNumber"/>
+      </w:pPr>
       <w:r>
-        <w:t>б/у, бу, авито, olx, алиэкспресс, aliexpress, вакансии, работа, резюме, своими руками, видео, скачать, чертеж, чертежи, схема, инструкция, wiki, википедия, форум, фото, картинки, обои, 3d, модель, бесплатно, даром, дешево, дешёво, китай, китайские, пластиковые, виниловые, сайдинг, металлические, пвх, osb, осб, гараж, забор, потолок, пол, внутри, внутренние, балкон, лоджия, фундамент, цокольный этаж, ремонт квартир, баня, сауна, теплица, хозблок, бытовка, контейнер, строительство многоквартирных</w:t>
+        <w:rPr>
+          <w:b/>
+        </w:rPr>
+        <w:t>Добавить группу</w:t>
+      </w:r>
+      <w:r>
+        <w:rPr>
+          <w:b w:val="0"/>
+        </w:rPr>
+        <w:t xml:space="preserve"> → название: `Приозерский район`.</w:t>
       </w:r>
     </w:p>
     <w:p>
+      <w:pPr>
+        <w:pStyle w:val="ListNumber"/>
+      </w:pPr>
       <w:r>
-        <w:t>**Дополнительно для группы «Приозерский район»:**</w:t>
+        <w:rPr>
+          <w:b/>
+        </w:rPr>
+        <w:t>Регион показа:</w:t>
+      </w:r>
+      <w:r>
+        <w:rPr>
+          <w:b w:val="0"/>
+        </w:rPr>
+        <w:t xml:space="preserve"> в настройках кампании убедиться, что выбрана Ленинградская область; для этой группы задать </w:t>
+      </w:r>
+      <w:r>
+        <w:rPr>
+          <w:b/>
+        </w:rPr>
+        <w:t>корректировку ставок</w:t>
+      </w:r>
+      <w:r>
+        <w:rPr>
+          <w:b w:val="0"/>
+        </w:rPr>
+        <w:t xml:space="preserve"> только для Приозерского района (Настройки → Корректировки → Гео).</w:t>
       </w:r>
     </w:p>
     <w:p>
+      <w:pPr>
+        <w:pStyle w:val="ListNumber"/>
+      </w:pPr>
       <w:r>
-        <w:t>москва, московская, спб санкт-петербург петербург, новгород, карелия, финляндия, финский залив, яхта, катер, лодка, причал, мост, дорога, асфальт</w:t>
+        <w:rPr>
+          <w:b/>
+        </w:rPr>
+        <w:t>Ключевые фразы:</w:t>
+      </w:r>
+      <w:r>
+        <w:rPr>
+          <w:b w:val="0"/>
+        </w:rPr>
+        <w:t xml:space="preserve"> Импорт → загрузить `termopaneli-priozersky-keywords.csv` или вставить вручную из таблиц выше.</w:t>
+      </w:r>
+    </w:p>
+    <w:p>
+      <w:pPr>
+        <w:pStyle w:val="ListNumber"/>
+      </w:pPr>
+      <w:r>
+        <w:rPr>
+          <w:b/>
+        </w:rPr>
+        <w:t>Объявления:</w:t>
+      </w:r>
+      <w:r>
+        <w:rPr>
+          <w:b w:val="0"/>
+        </w:rPr>
+        <w:t xml:space="preserve"> создать 5 объявлений по таблицам или импортировать из `termopaneli-priozersky-ads.csv`.</w:t>
+      </w:r>
+    </w:p>
+    <w:p>
+      <w:pPr>
+        <w:pStyle w:val="ListNumber"/>
+      </w:pPr>
+      <w:r>
+        <w:rPr>
+          <w:b/>
+        </w:rPr>
+        <w:t>Ссылка:</w:t>
+      </w:r>
+      <w:r>
+        <w:rPr>
+          <w:b w:val="0"/>
+        </w:rPr>
+        <w:t xml:space="preserve"> `https://marmara-pro.ru/termo` + UTM (см. выше).</w:t>
+      </w:r>
+    </w:p>
+    <w:p>
+      <w:pPr>
+        <w:pStyle w:val="ListNumber"/>
+      </w:pPr>
+      <w:r>
+        <w:rPr>
+          <w:b/>
+        </w:rPr>
+        <w:t>Минус-слова:</w:t>
+      </w:r>
+      <w:r>
+        <w:rPr>
+          <w:b w:val="0"/>
+        </w:rPr>
+        <w:t xml:space="preserve"> добавить списки из раздела «Минус-слова» на уровне кампании и группы.</w:t>
+      </w:r>
+    </w:p>
+    <w:p>
+      <w:pPr>
+        <w:pStyle w:val="ListNumber"/>
+      </w:pPr>
+      <w:r>
+        <w:rPr>
+          <w:b/>
+        </w:rPr>
+        <w:t>Ставки:</w:t>
+      </w:r>
+      <w:r>
+        <w:rPr>
+          <w:b w:val="0"/>
+        </w:rPr>
+        <w:t xml:space="preserve"> начальные 40–80 ₽ за клик (поиск, Ленобласть); через 1–2 недели оптимизировать по статистике.</w:t>
+      </w:r>
+    </w:p>
+    <w:p>
+      <w:pPr>
+        <w:pStyle w:val="ListNumber"/>
+      </w:pPr>
+      <w:r>
+        <w:rPr>
+          <w:b/>
+        </w:rPr>
+        <w:t>Модерация:</w:t>
+      </w:r>
+      <w:r>
+        <w:rPr>
+          <w:b w:val="0"/>
+        </w:rPr>
+        <w:t xml:space="preserve"> дождаться одобрения (обычно до 3 рабочих часов).</w:t>
       </w:r>
     </w:p>
     <w:p>
@@ -399,321 +3628,113 @@
         <w:pStyle w:val="Heading2"/>
       </w:pPr>
       <w:r>
-        <w:t>Объявления</w:t>
+        <w:t>Вариант Б — новая кампания только для Приозерского района</w:t>
       </w:r>
     </w:p>
     <w:p>
+      <w:pPr/>
       <w:r>
-        <w:t>Файл для импорта: [`termopaneli-priozersky-ads.csv`](termopaneli-priozersky-ads.csv)</w:t>
-      </w:r>
-    </w:p>
-    <w:p>
-      <w:r>
-        <w:t>**Без указания цен.** Лимиты Яндекс Директа: заголовок 1 — 56 символов, заголовок 2 — 30, текст — 81.</w:t>
+        <w:rPr>
+          <w:b w:val="0"/>
+        </w:rPr>
+        <w:t>Если отдельной кампании «Термопанели» ещё нет:</w:t>
       </w:r>
     </w:p>
     <w:p>
       <w:pPr>
-        <w:pStyle w:val="Heading3"/>
+        <w:pStyle w:val="ListNumber"/>
       </w:pPr>
       <w:r>
-        <w:t>Объявление 1</w:t>
+        <w:rPr>
+          <w:b/>
+        </w:rPr>
+        <w:t>Создать кампанию</w:t>
       </w:r>
-    </w:p>
-    <w:p>
       <w:r>
-        <w:t>| Поле | Текст | Символов |</w:t>
-      </w:r>
-    </w:p>
-    <w:p>
-      <w:r>
-        <w:t>|---|---|---|</w:t>
-      </w:r>
-    </w:p>
-    <w:p>
-      <w:r>
-        <w:t>| Заголовок 1 | Термопанели с клинкером — КлинкерПрофи | 37 |</w:t>
-      </w:r>
-    </w:p>
-    <w:p>
-      <w:r>
-        <w:t>| Заголовок 2 | Приозерский район | 17 |</w:t>
-      </w:r>
-    </w:p>
-    <w:p>
-      <w:r>
-        <w:t>| Текст | Утепление и фасад за один этап. Производство в Выборге. Доставка по Ленобласти. | 80 |</w:t>
-      </w:r>
-    </w:p>
-    <w:p>
-      <w:r>
-        <w:t>| Отображаемая ссылка | marmara-pro.ru/termo | |</w:t>
+        <w:rPr>
+          <w:b w:val="0"/>
+        </w:rPr>
+        <w:t xml:space="preserve"> → «Реклама в Поиске» → «Мастер кампаний» или «Режим эксперта».</w:t>
       </w:r>
     </w:p>
     <w:p>
       <w:pPr>
-        <w:pStyle w:val="Heading3"/>
+        <w:pStyle w:val="ListNumber"/>
       </w:pPr>
       <w:r>
-        <w:t>Объявление 2</w:t>
-      </w:r>
-    </w:p>
-    <w:p>
-      <w:r>
-        <w:t>| Поле | Текст | Символов |</w:t>
-      </w:r>
-    </w:p>
-    <w:p>
-      <w:r>
-        <w:t>|---|---|---|</w:t>
-      </w:r>
-    </w:p>
-    <w:p>
-      <w:r>
-        <w:t>| Заголовок 1 | Термопанели для дома в Приозерске | 33 |</w:t>
-      </w:r>
-    </w:p>
-    <w:p>
-      <w:r>
-        <w:t>| Заголовок 2 | Собственное производство | 24 |</w:t>
-      </w:r>
-    </w:p>
-    <w:p>
-      <w:r>
-        <w:t>| Текст | Клинкерный фасад без «мокрых» работ. Монтаж зимой до −15 °C. Звоните! | 71 |</w:t>
-      </w:r>
-    </w:p>
-    <w:p>
-      <w:r>
-        <w:t>| Отображаемая ссылка | marmara-pro.ru/termo | |</w:t>
+        <w:rPr>
+          <w:b w:val="0"/>
+        </w:rPr>
+        <w:t>Название: `КлинкерПрофи — термопанели`.</w:t>
       </w:r>
     </w:p>
     <w:p>
       <w:pPr>
-        <w:pStyle w:val="Heading3"/>
+        <w:pStyle w:val="ListNumber"/>
       </w:pPr>
       <w:r>
-        <w:t>Объявление 3</w:t>
+        <w:rPr>
+          <w:b w:val="0"/>
+        </w:rPr>
+        <w:t xml:space="preserve">Регион: </w:t>
       </w:r>
-    </w:p>
-    <w:p>
       <w:r>
-        <w:t>| Поле | Текст | Символов |</w:t>
+        <w:rPr>
+          <w:b/>
+        </w:rPr>
+        <w:t>Приозерский район, Ленинградская область</w:t>
       </w:r>
-    </w:p>
-    <w:p>
       <w:r>
-        <w:t>|---|---|---|</w:t>
-      </w:r>
-    </w:p>
-    <w:p>
-      <w:r>
-        <w:t>| Заголовок 1 | Фасадные термопанели с клинкером | 32 |</w:t>
-      </w:r>
-    </w:p>
-    <w:p>
-      <w:r>
-        <w:t>| Заголовок 2 | Доставка в Ленобласть | 21 |</w:t>
-      </w:r>
-    </w:p>
-    <w:p>
-      <w:r>
-        <w:t>| Текст | Завод в Выборге. Срок службы 25–50 лет. Не требуют покраски. Консультация. | 75 |</w:t>
-      </w:r>
-    </w:p>
-    <w:p>
-      <w:r>
-        <w:t>| Отображаемая ссылка | marmara-pro.ru/termo | |</w:t>
+        <w:rPr>
+          <w:b w:val="0"/>
+        </w:rPr>
+        <w:t xml:space="preserve"> (можно расширить до всей области с понижением ставок вне района).</w:t>
       </w:r>
     </w:p>
     <w:p>
       <w:pPr>
-        <w:pStyle w:val="Heading3"/>
+        <w:pStyle w:val="ListNumber"/>
       </w:pPr>
       <w:r>
-        <w:t>Объявление 4</w:t>
+        <w:rPr>
+          <w:b w:val="0"/>
+        </w:rPr>
+        <w:t xml:space="preserve">Создать одну группу </w:t>
       </w:r>
-    </w:p>
-    <w:p>
       <w:r>
-        <w:t>| Поле | Текст | Символов |</w:t>
+        <w:rPr>
+          <w:b/>
+        </w:rPr>
+        <w:t>Приозерский район</w:t>
       </w:r>
-    </w:p>
-    <w:p>
       <w:r>
-        <w:t>|---|---|---|</w:t>
-      </w:r>
-    </w:p>
-    <w:p>
-      <w:r>
-        <w:t>| Заголовок 1 | Клинкерные термопанели — КлинкерПрофи | 34 |</w:t>
-      </w:r>
-    </w:p>
-    <w:p>
-      <w:r>
-        <w:t>| Заголовок 2 | Приозерск и район | 17 |</w:t>
-      </w:r>
-    </w:p>
-    <w:p>
-      <w:r>
-        <w:t>| Текст | Сухой монтаж за дни, не недели. ППС и ППУ на выбор. Подберём толщину под дом. | 78 |</w:t>
-      </w:r>
-    </w:p>
-    <w:p>
-      <w:r>
-        <w:t>| Отображаемая ссылка | marmara-pro.ru/termo | |</w:t>
+        <w:rPr>
+          <w:b w:val="0"/>
+        </w:rPr>
+        <w:t xml:space="preserve"> и заполнить по этой спецификации.</w:t>
       </w:r>
     </w:p>
     <w:p>
       <w:pPr>
-        <w:pStyle w:val="Heading3"/>
+        <w:pStyle w:val="ListNumber"/>
       </w:pPr>
       <w:r>
-        <w:t>Объявление 5</w:t>
+        <w:rPr>
+          <w:b w:val="0"/>
+        </w:rPr>
+        <w:t xml:space="preserve">Подключить </w:t>
       </w:r>
-    </w:p>
-    <w:p>
       <w:r>
-        <w:t>| Поле | Текст | Символов |</w:t>
+        <w:rPr>
+          <w:b/>
+        </w:rPr>
+        <w:t>Яндекс Метрику</w:t>
       </w:r>
-    </w:p>
-    <w:p>
       <w:r>
-        <w:t>|---|---|---|</w:t>
-      </w:r>
-    </w:p>
-    <w:p>
-      <w:r>
-        <w:t>| Заголовок 1 | Утепление фасада термопанелями | 30 |</w:t>
-      </w:r>
-    </w:p>
-    <w:p>
-      <w:r>
-        <w:t>| Заголовок 2 | КлинкерПрофи, Выборг | 19 |</w:t>
-      </w:r>
-    </w:p>
-    <w:p>
-      <w:r>
-        <w:t>| Текст | Вид кирпичной кладки без кладки. Срок поставки от 7 дней. Доставка по области. | 77 |</w:t>
-      </w:r>
-    </w:p>
-    <w:p>
-      <w:r>
-        <w:t>| Отображаемая ссылка | marmara-pro.ru/termo | |</w:t>
-      </w:r>
-    </w:p>
-    <w:p>
-      <w:pPr>
-        <w:pStyle w:val="Heading3"/>
-      </w:pPr>
-      <w:r>
-        <w:t>Быстрые ссылки (расширения, на уровне кампании)</w:t>
-      </w:r>
-    </w:p>
-    <w:p>
-      <w:r>
-        <w:t>| Заголовок | URL |</w:t>
-      </w:r>
-    </w:p>
-    <w:p>
-      <w:r>
-        <w:t>|---|---|</w:t>
-      </w:r>
-    </w:p>
-    <w:p>
-      <w:r>
-        <w:t>| Каталог термопанелей | `https://marmara-pro.ru/termo` |</w:t>
-      </w:r>
-    </w:p>
-    <w:p>
-      <w:r>
-        <w:t>| Как монтируют | `https://marmara-pro.ru/termo#montazh` (или якорь на странице) |</w:t>
-      </w:r>
-    </w:p>
-    <w:p>
-      <w:r>
-        <w:t>| Контакты | `https://marmara-pro.ru/main#contacts` |</w:t>
-      </w:r>
-    </w:p>
-    <w:p>
-      <w:r>
-        <w:t>| Позвонить | `tel:+79217457755` |</w:t>
-      </w:r>
-    </w:p>
-    <w:p>
-      <w:pPr>
-        <w:pStyle w:val="Heading3"/>
-      </w:pPr>
-      <w:r>
-        <w:t>Уточнения</w:t>
-      </w:r>
-    </w:p>
-    <w:p>
-      <w:r>
-        <w:t>- Собственное производство в Выборге</w:t>
-      </w:r>
-    </w:p>
-    <w:p>
-      <w:r>
-        <w:t>- Доставка по Ленинградской области</w:t>
-      </w:r>
-    </w:p>
-    <w:p>
-      <w:r>
-        <w:t>- Срок службы 25–50 лет</w:t>
-      </w:r>
-    </w:p>
-    <w:p>
-      <w:r>
-        <w:t>- Монтаж зимой до −15 °C</w:t>
-      </w:r>
-    </w:p>
-    <w:p>
-      <w:r>
-        <w:t>- Пенополистирол и пенополиуретан</w:t>
-      </w:r>
-    </w:p>
-    <w:p>
-      <w:r>
-        <w:t>- Консультация и подбор толщины</w:t>
-      </w:r>
-    </w:p>
-    <w:p>
-      <w:pPr>
-        <w:pStyle w:val="Heading3"/>
-      </w:pPr>
-      <w:r>
-        <w:t>Визитка (если подключена)</w:t>
-      </w:r>
-    </w:p>
-    <w:p>
-      <w:r>
-        <w:t>| Поле | Значение |</w:t>
-      </w:r>
-    </w:p>
-    <w:p>
-      <w:r>
-        <w:t>|---|---|</w:t>
-      </w:r>
-    </w:p>
-    <w:p>
-      <w:r>
-        <w:t>| Организация | КлинкерПрофи |</w:t>
-      </w:r>
-    </w:p>
-    <w:p>
-      <w:r>
-        <w:t>| Телефон | +7 (921) 745-77-55 |</w:t>
-      </w:r>
-    </w:p>
-    <w:p>
-      <w:r>
-        <w:t>| Адрес | г. Выборг, ул. Ленина, 11 |</w:t>
-      </w:r>
-    </w:p>
-    <w:p>
-      <w:r>
-        <w:t>| Режим работы | ежедневно 9:00–20:00 |</w:t>
+        <w:rPr>
+          <w:b w:val="0"/>
+        </w:rPr>
+        <w:t xml:space="preserve"> (счётчик на marmara-pro.ru), цели: «Отправка формы», «Клик по телефону».</w:t>
       </w:r>
     </w:p>
     <w:p>
@@ -721,154 +3742,178 @@
         <w:pStyle w:val="Heading2"/>
       </w:pPr>
       <w:r>
-        <w:t>Инструкция: добавить группу в Яндекс Директ</w:t>
+        <w:t>Проверка после запуска</w:t>
       </w:r>
     </w:p>
     <w:p>
       <w:pPr>
-        <w:pStyle w:val="Heading3"/>
+        <w:pStyle w:val="ListBullet"/>
       </w:pPr>
       <w:r>
-        <w:t>Вариант А — группа в существующей кампании «Термопанели»</w:t>
-      </w:r>
-    </w:p>
-    <w:p>
-      <w:r>
-        <w:t>1. Войти в [Яндекс Директ](https://direct.yandex.ru/) → кампания **Термопанели**.</w:t>
-      </w:r>
-    </w:p>
-    <w:p>
-      <w:r>
-        <w:t>2. **Добавить группу** → название: `Приозерский район`.</w:t>
-      </w:r>
-    </w:p>
-    <w:p>
-      <w:r>
-        <w:t>3. **Регион показа:** в настройках кампании убедиться, что выбрана Ленинградская область; для этой группы задать **корректировку ставок** только для Приозерского района (Настройки → Корректировки → Гео).</w:t>
-      </w:r>
-    </w:p>
-    <w:p>
-      <w:r>
-        <w:t>4. **Ключевые фразы:** Импорт → загрузить `termopaneli-priozersky-keywords.csv` или вставить вручную из таблиц выше.</w:t>
-      </w:r>
-    </w:p>
-    <w:p>
-      <w:r>
-        <w:t>5. **Объявления:** создать 5 объявлений по таблицам или импортировать из `termopaneli-priozersky-ads.csv`.</w:t>
-      </w:r>
-    </w:p>
-    <w:p>
-      <w:r>
-        <w:t>6. **Ссылка:** `https://marmara-pro.ru/termo` + UTM (см. выше).</w:t>
-      </w:r>
-    </w:p>
-    <w:p>
-      <w:r>
-        <w:t>7. **Минус-слова:** добавить списки из раздела «Минус-слова» на уровне кампании и группы.</w:t>
-      </w:r>
-    </w:p>
-    <w:p>
-      <w:r>
-        <w:t>8. **Ставки:** начальные 40–80 ₽ за клик (поиск, Ленобласть); через 1–2 недели оптимизировать по статистике.</w:t>
-      </w:r>
-    </w:p>
-    <w:p>
-      <w:r>
-        <w:t>9. **Модерация:** дождаться одобрения (обычно до 3 рабочих часов).</w:t>
+        <w:rPr>
+          <w:b w:val="0"/>
+        </w:rPr>
+        <w:t>[Вордстат](https://wordstat.yandex.ru/) — частотность по «термопанели приозерск».</w:t>
       </w:r>
     </w:p>
     <w:p>
       <w:pPr>
-        <w:pStyle w:val="Heading3"/>
+        <w:pStyle w:val="ListBullet"/>
       </w:pPr>
       <w:r>
-        <w:t>Вариант Б — новая кампания только для Приозерского района</w:t>
-      </w:r>
-    </w:p>
-    <w:p>
-      <w:r>
-        <w:t>Если отдельной кампании «Термопанели» ещё нет:</w:t>
-      </w:r>
-    </w:p>
-    <w:p>
-      <w:r>
-        <w:t>1. **Создать кампанию** → «Реклама в Поиске» → «Мастер кампаний» или «Режим эксперта».</w:t>
-      </w:r>
-    </w:p>
-    <w:p>
-      <w:r>
-        <w:t>2. Название: `КлинкерПрофи — термопанели`.</w:t>
-      </w:r>
-    </w:p>
-    <w:p>
-      <w:r>
-        <w:t>3. Регион: **Приозерский район, Ленинградская область** (можно расширить до всей области с понижением ставок вне района).</w:t>
-      </w:r>
-    </w:p>
-    <w:p>
-      <w:r>
-        <w:t>4. Создать одну группу **Приозерский район** и заполнить по этой спецификации.</w:t>
-      </w:r>
-    </w:p>
-    <w:p>
-      <w:r>
-        <w:t>5. Подключить **Яндекс Метрику** (счётчик на marmara-pro.ru), цели: «Отправка формы», «Клик по телефону».</w:t>
+        <w:rPr>
+          <w:b w:val="0"/>
+        </w:rPr>
+        <w:t>[Метрика](https://metrika.yandex.ru/) — UTM `utm_content=priozersky`.</w:t>
       </w:r>
     </w:p>
     <w:p>
       <w:pPr>
-        <w:pStyle w:val="Heading3"/>
+        <w:pStyle w:val="ListBullet"/>
       </w:pPr>
       <w:r>
-        <w:t>Проверка после запуска</w:t>
+        <w:rPr>
+          <w:b w:val="0"/>
+        </w:rPr>
+        <w:t xml:space="preserve">Директ → </w:t>
       </w:r>
-    </w:p>
-    <w:p>
       <w:r>
-        <w:t>- [Вордстат](https://wordstat.yandex.ru/) — частотность по «термопанели приозерск».</w:t>
+        <w:rPr>
+          <w:b/>
+        </w:rPr>
+        <w:t>Поисковые запросы</w:t>
       </w:r>
-    </w:p>
-    <w:p>
       <w:r>
-        <w:t>- [Метрика](https://metrika.yandex.ru/) — UTM `utm_content=priozersky`.</w:t>
-      </w:r>
-    </w:p>
-    <w:p>
-      <w:r>
-        <w:t>- Директ → **Поисковые запросы** — добавлять нерелевантные в минус-слова еженедельно.</w:t>
+        <w:rPr>
+          <w:b w:val="0"/>
+        </w:rPr>
+        <w:t xml:space="preserve"> — добавлять нерелевантные в минус-слова еженедельно.</w:t>
       </w:r>
     </w:p>
     <w:p>
       <w:pPr>
-        <w:pStyle w:val="Heading2"/>
+        <w:pStyle w:val="Heading1"/>
       </w:pPr>
       <w:r>
-        <w:t>Связанные материалы в репозитории</w:t>
+        <w:t>7. Связанные материалы в репозитории</w:t>
       </w:r>
     </w:p>
+    <w:tbl>
+      <w:tblPr>
+        <w:tblStyle w:val="TableGrid"/>
+        <w:tblW w:type="auto" w:w="0"/>
+        <w:tblLook w:firstColumn="1" w:firstRow="1" w:lastColumn="0" w:lastRow="0" w:noHBand="0" w:noVBand="1" w:val="04A0"/>
+      </w:tblPr>
+      <w:tblGrid>
+        <w:gridCol w:w="4320"/>
+        <w:gridCol w:w="4320"/>
+      </w:tblGrid>
+      <w:tr>
+        <w:tc>
+          <w:tcPr>
+            <w:tcW w:type="dxa" w:w="4320"/>
+          </w:tcPr>
+          <w:p>
+            <w:r>
+              <w:rPr>
+                <w:b/>
+              </w:rPr>
+            </w:r>
+            <w:r>
+              <w:rPr>
+                <w:b/>
+              </w:rPr>
+              <w:t>Файл</w:t>
+            </w:r>
+          </w:p>
+        </w:tc>
+        <w:tc>
+          <w:tcPr>
+            <w:tcW w:type="dxa" w:w="4320"/>
+          </w:tcPr>
+          <w:p>
+            <w:r>
+              <w:rPr>
+                <w:b/>
+              </w:rPr>
+            </w:r>
+            <w:r>
+              <w:rPr>
+                <w:b/>
+              </w:rPr>
+              <w:t>Назначение</w:t>
+            </w:r>
+          </w:p>
+        </w:tc>
+      </w:tr>
+      <w:tr>
+        <w:tc>
+          <w:tcPr>
+            <w:tcW w:type="dxa" w:w="4320"/>
+          </w:tcPr>
+          <w:p>
+            <w:r/>
+            <w:r>
+              <w:rPr>
+                <w:b w:val="0"/>
+              </w:rPr>
+              <w:t>agents/termopaneli/faq.md</w:t>
+            </w:r>
+          </w:p>
+        </w:tc>
+        <w:tc>
+          <w:tcPr>
+            <w:tcW w:type="dxa" w:w="4320"/>
+          </w:tcPr>
+          <w:p>
+            <w:r/>
+            <w:r>
+              <w:rPr>
+                <w:b w:val="0"/>
+              </w:rPr>
+              <w:t>База знаний для агента и текстов объявлений</w:t>
+            </w:r>
+          </w:p>
+        </w:tc>
+      </w:tr>
+      <w:tr>
+        <w:tc>
+          <w:tcPr>
+            <w:tcW w:type="dxa" w:w="4320"/>
+          </w:tcPr>
+          <w:p>
+            <w:r/>
+            <w:r>
+              <w:rPr>
+                <w:b w:val="0"/>
+              </w:rPr>
+              <w:t>sites/marmara-pro/termo-microdata.html</w:t>
+            </w:r>
+          </w:p>
+        </w:tc>
+        <w:tc>
+          <w:tcPr>
+            <w:tcW w:type="dxa" w:w="4320"/>
+          </w:tcPr>
+          <w:p>
+            <w:r/>
+            <w:r>
+              <w:rPr>
+                <w:b w:val="0"/>
+              </w:rPr>
+              <w:t>Микроразметка посадочной страницы</w:t>
+            </w:r>
+          </w:p>
+        </w:tc>
+      </w:tr>
+    </w:tbl>
+    <w:p/>
     <w:p>
       <w:r>
-        <w:t>| Файл | Назначение |</w:t>
-      </w:r>
-    </w:p>
-    <w:p>
-      <w:r>
-        <w:t>|---|---|</w:t>
-      </w:r>
-    </w:p>
-    <w:p>
-      <w:r>
-        <w:t>| `agents/termopaneli/faq.md` | База знаний для агента и текстов объявлений |</w:t>
-      </w:r>
-    </w:p>
-    <w:p>
-      <w:r>
-        <w:t>| `sites/marmara-pro/termo-microdata.html` | Микроразметка посадочной страницы |</w:t>
-      </w:r>
-    </w:p>
-    <w:p>
-      <w:r>
-        <w:t>*Клиент: КлинкерПрофи · ИП Баушев Дмитрий Викторович · г. Выборг*</w:t>
+        <w:rPr>
+          <w:i/>
+        </w:rPr>
+        <w:t>Клиент: КлинкерПрофи · ИП Баушев Дмитрий Викторович · г. Выборг</w:t>
       </w:r>
     </w:p>
     <w:sectPr>

</xml_diff>